<commit_message>
Bound the deal push and size it by delivery gap
Per review: loss stop at 3x contribution per top-of-search order, a spend
envelope for 09-24..09-28, share stop at 40% and flat, reachability check
(requirement vs delivered / share), post-deal step-down to break-even.
Step sized by delivery gap (+30/+20/+10), halved where the 15 Sep raise
bought no impression share; no step at requirement. One rank source: the
tracker's 7-day median. Queen Size fixed bid starts near what dynamic paid.
A5 restored-state, olive-child tracker check, deal CVR note, contribution
caveat, 6-piece toned down, multi-target note.

Co-Authored-By: Claude Opus 5.5 <noreply@anthropic.com>
Claude-Session: https://claude.ai/code/session_01FvXHKtbYmE3ru99HYV2muV
</commit_message>
<xml_diff>
--- a/docs/DBS4_Corrections_by_Situation_20260921-dbcd48b8.docx
+++ b/docs/DBS4_Corrections_by_Situation_20260921-dbcd48b8.docx
@@ -22,7 +22,7 @@
           <w:b w:val="0"/>
           <w:i w:val="0"/>
         </w:rPr>
-        <w:t>The goal this cycle is to climb the in-focus keywords inside the Best Deal (15–28 September). Every day of the deal counts, so every in-focus exact ranking campaign is pushed on top of search, every day, until its top-of-search clicks arrive — none is held for being thin or for review. The target for where clicks land is top of search above 70% and product pages under 20%. Cost per click is re-evaluated once the clicks are arriving, not before. Out-of-focus campaigns take no new money and are judged on their own numbers.</w:t>
+        <w:t>The goal this cycle is to climb the in-focus keywords inside the Best Deal (15–28 September). Every day of the deal counts, so every in-focus exact ranking campaign is pushed on top of search, every day, until its top-of-search clicks arrive — none is held for being thin or for review. The engine’s market limit is off for the deal; what bounds the push is money: no campaign steps past a top-of-search cost per order of 3× contribution (about $75), and the whole push runs inside one spend envelope. The target for where clicks land is top of search above 70% and product pages under 20%. Out-of-focus campaigns take no new money and are judged on their own numbers.</w:t>
       </w:r>
     </w:p>
     <w:p>
@@ -34,7 +34,7 @@
           <w:b w:val="0"/>
           <w:i w:val="0"/>
         </w:rPr>
-        <w:t>Each section gives the rule, what the run did, named campaigns as evidence, and the correction. Every in-focus campaign’s write is in one table (section A1); the rest of Part A explains the situations inside it. The full list of which campaign sits where is at the end, and in the companion spreadsheet. Part D answers Erik’s question for B4 — are we short of top-of-search traffic, or short of CTR/CVR at the top — by syntax group and by keyword, with the performance-vs-tuning history, competitors, the 6-piece listing bidding in the same auctions, the campaign types that should also be running and the metrics the app should read.</w:t>
+        <w:t>Each section gives the rule, what the run did, two or three campaigns where the run’s action is the problem, and the correction. Ranks throughout are the tracker’s 7-day median — one day’s reading on the head term swings between 16 and 44 in a week. Part D answers Erik’s question for B4 — are we short of top-of-search traffic, or short of CTR/CVR at the top — with the performance-vs-tuning history, competitors, the 6-piece listing in the same auctions, the campaign types that should also be running and the metrics the app should read.</w:t>
       </w:r>
     </w:p>
     <w:p>
@@ -925,7 +925,64 @@
           <w:b w:val="0"/>
           <w:i w:val="0"/>
         </w:rPr>
-        <w:t>During the deal every in-focus exact ranking campaign is pushed on the top-of-search modifier, every day, until its required top-of-search clicks arrive. Nothing is held for being thin, for having no clicks yet, or for review — a campaign that is not getting clicks is not in the auction, and only the top-of-search price can put it there. The size of each day’s step follows how far the keyword is from its rank target: within 5 positions +10%; up to twice the target +20%; further +30%; no rank read +25%. The base is held unless product pages are over 20% (then it comes down in the same write). Where 80% or more of the budget was used in the last 7 days, the budget goes up 30% in the same write. There is no price cap during the deal: once top-of-search clicks are arriving at the required rate, cost per click is re-evaluated and probed down. The only in-focus campaigns not pushed are those already delivering their required clicks.</w:t>
+        <w:t>During the deal every in-focus exact ranking campaign is pushed on the top-of-search modifier, every day, until its required top-of-search clicks arrive. Nothing is held for being thin, for having no clicks yet, or for review — a campaign that is not getting clicks is not in the auction, and only the top-of-search price can put it there.</w:t>
+      </w:r>
+    </w:p>
+    <w:p>
+      <w:pPr>
+        <w:spacing w:after="100"/>
+      </w:pPr>
+      <w:r>
+        <w:rPr>
+          <w:b/>
+          <w:color w:val="1F3A5F"/>
+        </w:rPr>
+        <w:t xml:space="preserve">How big each day’s step is. </w:t>
+      </w:r>
+      <w:r>
+        <w:rPr>
+          <w:b w:val="0"/>
+          <w:i w:val="0"/>
+        </w:rPr>
+        <w:t>Sized by the delivery gap — top-of-search clicks a day in the deal against the requirement: under 30% delivered +30%; 30–70% +20%; over 70% +10%; at or over the requirement, no step. Where the last raise (15 September) did not lift impression share, the step is halved: price that bought no share buys no more by being repeated. Rank distance only breaks ties. A campaign with no click requirement on file takes +20% — a stated departure from the logic document, which would hold it at the ceiling with no premium; these are low-volume terms, and the push doubles as the eligibility check.</w:t>
+      </w:r>
+    </w:p>
+    <w:p>
+      <w:pPr>
+        <w:spacing w:after="100"/>
+      </w:pPr>
+      <w:r>
+        <w:rPr>
+          <w:b/>
+          <w:color w:val="1F3A5F"/>
+        </w:rPr>
+        <w:t xml:space="preserve">What stops it. </w:t>
+      </w:r>
+      <w:r>
+        <w:rPr>
+          <w:b w:val="0"/>
+          <w:i w:val="0"/>
+        </w:rPr>
+        <w:t>Four things, each written on the row. (1) The loss stop: the top-of-search price may not pass the point where a top-of-search order costs more than 3× contribution — 3 × contribution (the advertised child’s; $25.06 on average) × the campaign’s top-of-search conversion rate (its own, with 30+ top-of-search clicks in 90 days; otherwise the product’s planning rate). Every pushed row carries its cost and loss per order at the new price. Contribution is at list price; the deal price is lower, so the true loss per order in the deal is somewhat higher than written. (2) The share stop: impression share at 40% or more and not rising after the last step — the requirement is overstated, not the price; it is re-based from actual volume. (3) The reachability check: delivered clicks ÷ impression share is what winning the whole auction would buy; where the requirement is above that, the campaign is pushed toward share and graded on share, not on an unbuyable click count. (4) The envelope: the whole deal push runs inside 1.5× today’s daily spend on these campaigns for 09-24 → 09-28; when it is spent, every row holds.</w:t>
+      </w:r>
+    </w:p>
+    <w:p>
+      <w:pPr>
+        <w:spacing w:after="100"/>
+      </w:pPr>
+      <w:r>
+        <w:rPr>
+          <w:b/>
+          <w:color w:val="1F3A5F"/>
+        </w:rPr>
+        <w:t xml:space="preserve">What every write covers. </w:t>
+      </w:r>
+      <w:r>
+        <w:rPr>
+          <w:b w:val="0"/>
+          <w:i w:val="0"/>
+        </w:rPr>
+        <w:t>The base is held unless product pages are over 20% (then it comes down in the same write). The top-of-search modifier applies to every target in the campaign; a base cut is applied as the same percentage to every enabled target, and the price quoted is the plan keyword’s. Where 80% or more of the budget was used in the last 7 days, the budget goes up 30% in the same write.</w:t>
       </w:r>
     </w:p>
     <w:p>
@@ -944,7 +1001,26 @@
           <w:b w:val="0"/>
           <w:i w:val="0"/>
         </w:rPr>
-        <w:t>Each morning to 09-28, per campaign: top-of-search clicks yesterday, where the clicks landed, budget use. Clicks not yet at the requirement — step again (same sizing rule). Clicks at the requirement — stop stepping; from here the question is cost per click. Clicks landing on product pages — cut the base, don’t stop the top-of-search push. Still zero after two steps — check the ad is live, the child it serves, and the listing, while the push continues.</w:t>
+        <w:t>Each morning to 09-28, per campaign: top-of-search clicks yesterday, impression share, where the clicks landed, budget use and hours out of budget. The two levers are graded separately: the price step on impression share (rose → keep stepping; flat → halve the next step), the budget raise on hours out of budget. Clicks at the requirement — stop stepping. Clicks landing on product pages — cut the base, don’t stop the top-of-search push. Still zero after two steps — check the ad is live, the child it serves, and the listing, while the push continues.</w:t>
+      </w:r>
+    </w:p>
+    <w:p>
+      <w:pPr>
+        <w:spacing w:after="100"/>
+      </w:pPr>
+      <w:r>
+        <w:rPr>
+          <w:b/>
+          <w:color w:val="1F3A5F"/>
+        </w:rPr>
+        <w:t xml:space="preserve">After the deal (from 09-29). </w:t>
+      </w:r>
+      <w:r>
+        <w:rPr>
+          <w:b w:val="0"/>
+          <w:i w:val="0"/>
+        </w:rPr>
+        <w:t>The velocity condition lapses with the deal. A campaign that reached its requirement moves to cost-per-click evaluation: probe down 3–5% a step while click share holds. One that did not reach it does not keep stepping: its top-of-search price steps down to break-even (contribution × its top-of-search conversion rate) over two writes four days apart, unless its 7-day rank has moved into the target range, in which case it holds one week at the deal price and is read again. The decision is written on the row.</w:t>
       </w:r>
     </w:p>
     <w:p>
@@ -963,7 +1039,7 @@
           <w:b w:val="0"/>
           <w:i w:val="0"/>
         </w:rPr>
-        <w:t>Of the 87 in-focus campaigns that should be pushed, the run raised the top-of-search price on 48, cut it on 2 and held 29. It held rows for being thin (low search volume, no rank read), for a rank collapse, for sitting at the market limit, and on budget — and it sized its raises to a checkpoint on 09-25 rather than a daily step.</w:t>
+        <w:t>Of the 88 in-focus campaigns that should be pushed, the run raised the top-of-search price on 48, cut it on 2 and held 29. It held rows for being thin (low search volume, no rank read), for a rank collapse, for sitting at the market limit, and on budget — and it sized its raises to a checkpoint on 09-25 rather than a daily step.</w:t>
       </w:r>
     </w:p>
     <w:p>
@@ -971,7 +1047,7 @@
         <w:pStyle w:val="Heading1"/>
       </w:pPr>
       <w:r>
-        <w:t>A1. The push in numbers (87 pushed, 1 delivering, 1 with its keyword paused)</w:t>
+        <w:t>A1. The push in numbers (86 stepped, 2 at requirement, 1 with its keyword paused)</w:t>
       </w:r>
     </w:p>
     <w:p>
@@ -990,7 +1066,7 @@
           <w:b w:val="0"/>
           <w:i w:val="0"/>
         </w:rPr>
-        <w:t>Every in-focus campaign that is not yet delivering its clicks gets a top-of-search step sized by its rank gap, in the same write as any base cut or budget raise it needs. The sections below take each situation in turn with the campaigns where the run got it most wrong; the step for every campaign follows the same rule.</w:t>
+        <w:t>Every in-focus campaign short of its clicks gets a top-of-search step sized by its delivery gap, in the same write as any base cut or budget raise it needs, inside the loss stop. The sections below take each situation in turn with the campaigns where the run got it most wrong; every campaign follows the same rule.</w:t>
       </w:r>
     </w:p>
     <w:tbl>
@@ -1001,18 +1077,19 @@
         <w:tblLook w:firstColumn="1" w:firstRow="1" w:lastColumn="0" w:lastRow="0" w:noHBand="0" w:noVBand="1" w:val="04A0"/>
       </w:tblPr>
       <w:tblGrid>
-        <w:gridCol w:w="1425"/>
-        <w:gridCol w:w="1425"/>
-        <w:gridCol w:w="1425"/>
-        <w:gridCol w:w="1425"/>
-        <w:gridCol w:w="1425"/>
-        <w:gridCol w:w="1425"/>
-        <w:gridCol w:w="1425"/>
+        <w:gridCol w:w="1246"/>
+        <w:gridCol w:w="1246"/>
+        <w:gridCol w:w="1246"/>
+        <w:gridCol w:w="1246"/>
+        <w:gridCol w:w="1246"/>
+        <w:gridCol w:w="1246"/>
+        <w:gridCol w:w="1246"/>
+        <w:gridCol w:w="1246"/>
       </w:tblGrid>
       <w:tr>
         <w:tc>
           <w:tcPr>
-            <w:tcW w:type="dxa" w:w="2948"/>
+            <w:tcW w:type="dxa" w:w="2835"/>
             <w:shd w:val="clear" w:color="auto" w:fill="1F3A5F"/>
           </w:tcPr>
           <w:p>
@@ -1021,7 +1098,7 @@
               <w:rPr>
                 <w:b/>
                 <w:color w:val="FFFFFF"/>
-                <w:sz w:val="16"/>
+                <w:sz w:val="15"/>
               </w:rPr>
               <w:t>Step</w:t>
             </w:r>
@@ -1029,7 +1106,7 @@
         </w:tc>
         <w:tc>
           <w:tcPr>
-            <w:tcW w:type="dxa" w:w="907"/>
+            <w:tcW w:type="dxa" w:w="794"/>
             <w:shd w:val="clear" w:color="auto" w:fill="1F3A5F"/>
           </w:tcPr>
           <w:p>
@@ -1038,7 +1115,7 @@
               <w:rPr>
                 <w:b/>
                 <w:color w:val="FFFFFF"/>
-                <w:sz w:val="16"/>
+                <w:sz w:val="15"/>
               </w:rPr>
               <w:t>Campaigns</w:t>
             </w:r>
@@ -1046,7 +1123,7 @@
         </w:tc>
         <w:tc>
           <w:tcPr>
-            <w:tcW w:type="dxa" w:w="1020"/>
+            <w:tcW w:type="dxa" w:w="850"/>
             <w:shd w:val="clear" w:color="auto" w:fill="1F3A5F"/>
           </w:tcPr>
           <w:p>
@@ -1055,7 +1132,7 @@
               <w:rPr>
                 <w:b/>
                 <w:color w:val="FFFFFF"/>
-                <w:sz w:val="16"/>
+                <w:sz w:val="15"/>
               </w:rPr>
               <w:t>Run raised TOS</w:t>
             </w:r>
@@ -1063,7 +1140,7 @@
         </w:tc>
         <w:tc>
           <w:tcPr>
-            <w:tcW w:type="dxa" w:w="907"/>
+            <w:tcW w:type="dxa" w:w="850"/>
             <w:shd w:val="clear" w:color="auto" w:fill="1F3A5F"/>
           </w:tcPr>
           <w:p>
@@ -1072,9 +1149,9 @@
               <w:rPr>
                 <w:b/>
                 <w:color w:val="FFFFFF"/>
-                <w:sz w:val="16"/>
-              </w:rPr>
-              <w:t>Run cut TOS</w:t>
+                <w:sz w:val="15"/>
+              </w:rPr>
+              <w:t>Run cut or held</w:t>
             </w:r>
           </w:p>
         </w:tc>
@@ -1089,15 +1166,15 @@
               <w:rPr>
                 <w:b/>
                 <w:color w:val="FFFFFF"/>
-                <w:sz w:val="16"/>
-              </w:rPr>
-              <w:t>Run held</w:t>
-            </w:r>
-          </w:p>
-        </w:tc>
-        <w:tc>
-          <w:tcPr>
-            <w:tcW w:type="dxa" w:w="1304"/>
+                <w:sz w:val="15"/>
+              </w:rPr>
+              <w:t>At the loss stop</w:t>
+            </w:r>
+          </w:p>
+        </w:tc>
+        <w:tc>
+          <w:tcPr>
+            <w:tcW w:type="dxa" w:w="1247"/>
             <w:shd w:val="clear" w:color="auto" w:fill="1F3A5F"/>
           </w:tcPr>
           <w:p>
@@ -1106,15 +1183,15 @@
               <w:rPr>
                 <w:b/>
                 <w:color w:val="FFFFFF"/>
-                <w:sz w:val="16"/>
-              </w:rPr>
-              <w:t>Base cut in the same write</w:t>
-            </w:r>
-          </w:p>
-        </w:tc>
-        <w:tc>
-          <w:tcPr>
-            <w:tcW w:type="dxa" w:w="1304"/>
+                <w:sz w:val="15"/>
+              </w:rPr>
+              <w:t>Requirement above what the auction holds</w:t>
+            </w:r>
+          </w:p>
+        </w:tc>
+        <w:tc>
+          <w:tcPr>
+            <w:tcW w:type="dxa" w:w="1134"/>
             <w:shd w:val="clear" w:color="auto" w:fill="1F3A5F"/>
           </w:tcPr>
           <w:p>
@@ -1123,9 +1200,26 @@
               <w:rPr>
                 <w:b/>
                 <w:color w:val="FFFFFF"/>
-                <w:sz w:val="16"/>
-              </w:rPr>
-              <w:t>Budget +30% in the same write</w:t>
+                <w:sz w:val="15"/>
+              </w:rPr>
+              <w:t>Median loss per order at new price</w:t>
+            </w:r>
+          </w:p>
+        </w:tc>
+        <w:tc>
+          <w:tcPr>
+            <w:tcW w:type="dxa" w:w="794"/>
+            <w:shd w:val="clear" w:color="auto" w:fill="1F3A5F"/>
+          </w:tcPr>
+          <w:p>
+            <w:r/>
+            <w:r>
+              <w:rPr>
+                <w:b/>
+                <w:color w:val="FFFFFF"/>
+                <w:sz w:val="15"/>
+              </w:rPr>
+              <w:t>Budget +30%</w:t>
             </w:r>
           </w:p>
         </w:tc>
@@ -1133,47 +1227,79 @@
       <w:tr>
         <w:tc>
           <w:tcPr>
-            <w:tcW w:type="dxa" w:w="2948"/>
-          </w:tcPr>
-          <w:p>
-            <w:r/>
-            <w:r>
-              <w:rPr>
-                <w:b w:val="0"/>
-                <w:i w:val="0"/>
-                <w:sz w:val="16"/>
-              </w:rPr>
-              <w:t>+10% — within 5 positions of target</w:t>
-            </w:r>
-          </w:p>
-        </w:tc>
-        <w:tc>
-          <w:tcPr>
-            <w:tcW w:type="dxa" w:w="907"/>
-          </w:tcPr>
-          <w:p>
-            <w:r/>
-            <w:r>
-              <w:rPr>
-                <w:b w:val="0"/>
-                <w:i w:val="0"/>
-                <w:sz w:val="16"/>
-              </w:rPr>
-              <w:t>2</w:t>
-            </w:r>
-          </w:p>
-        </w:tc>
-        <w:tc>
-          <w:tcPr>
-            <w:tcW w:type="dxa" w:w="1020"/>
-          </w:tcPr>
-          <w:p>
-            <w:r/>
-            <w:r>
-              <w:rPr>
-                <w:b w:val="0"/>
-                <w:i w:val="0"/>
-                <w:sz w:val="16"/>
+            <w:tcW w:type="dxa" w:w="2835"/>
+          </w:tcPr>
+          <w:p>
+            <w:r/>
+            <w:r>
+              <w:rPr>
+                <w:b w:val="0"/>
+                <w:i w:val="0"/>
+                <w:sz w:val="15"/>
+              </w:rPr>
+              <w:t>+30% — under 30% of required clicks delivered</w:t>
+            </w:r>
+          </w:p>
+        </w:tc>
+        <w:tc>
+          <w:tcPr>
+            <w:tcW w:type="dxa" w:w="794"/>
+          </w:tcPr>
+          <w:p>
+            <w:r/>
+            <w:r>
+              <w:rPr>
+                <w:b w:val="0"/>
+                <w:i w:val="0"/>
+                <w:sz w:val="15"/>
+              </w:rPr>
+              <w:t>47</w:t>
+            </w:r>
+          </w:p>
+        </w:tc>
+        <w:tc>
+          <w:tcPr>
+            <w:tcW w:type="dxa" w:w="850"/>
+          </w:tcPr>
+          <w:p>
+            <w:r/>
+            <w:r>
+              <w:rPr>
+                <w:b w:val="0"/>
+                <w:i w:val="0"/>
+                <w:sz w:val="15"/>
+              </w:rPr>
+              <w:t>26</w:t>
+            </w:r>
+          </w:p>
+        </w:tc>
+        <w:tc>
+          <w:tcPr>
+            <w:tcW w:type="dxa" w:w="850"/>
+          </w:tcPr>
+          <w:p>
+            <w:r/>
+            <w:r>
+              <w:rPr>
+                <w:b w:val="0"/>
+                <w:i w:val="0"/>
+                <w:sz w:val="15"/>
+              </w:rPr>
+              <w:t>17</w:t>
+            </w:r>
+          </w:p>
+        </w:tc>
+        <w:tc>
+          <w:tcPr>
+            <w:tcW w:type="dxa" w:w="794"/>
+          </w:tcPr>
+          <w:p>
+            <w:r/>
+            <w:r>
+              <w:rPr>
+                <w:b w:val="0"/>
+                <w:i w:val="0"/>
+                <w:sz w:val="15"/>
               </w:rPr>
               <w:t>1</w:t>
             </w:r>
@@ -1181,17 +1307,33 @@
         </w:tc>
         <w:tc>
           <w:tcPr>
-            <w:tcW w:type="dxa" w:w="907"/>
-          </w:tcPr>
-          <w:p>
-            <w:r/>
-            <w:r>
-              <w:rPr>
-                <w:b w:val="0"/>
-                <w:i w:val="0"/>
-                <w:sz w:val="16"/>
-              </w:rPr>
-              <w:t>0</w:t>
+            <w:tcW w:type="dxa" w:w="1247"/>
+          </w:tcPr>
+          <w:p>
+            <w:r/>
+            <w:r>
+              <w:rPr>
+                <w:b w:val="0"/>
+                <w:i w:val="0"/>
+                <w:sz w:val="15"/>
+              </w:rPr>
+              <w:t>3</w:t>
+            </w:r>
+          </w:p>
+        </w:tc>
+        <w:tc>
+          <w:tcPr>
+            <w:tcW w:type="dxa" w:w="1134"/>
+          </w:tcPr>
+          <w:p>
+            <w:r/>
+            <w:r>
+              <w:rPr>
+                <w:b w:val="0"/>
+                <w:i w:val="0"/>
+                <w:sz w:val="15"/>
+              </w:rPr>
+              <w:t>$13</w:t>
             </w:r>
           </w:p>
         </w:tc>
@@ -1205,41 +1347,9 @@
               <w:rPr>
                 <w:b w:val="0"/>
                 <w:i w:val="0"/>
-                <w:sz w:val="16"/>
-              </w:rPr>
-              <w:t>1</w:t>
-            </w:r>
-          </w:p>
-        </w:tc>
-        <w:tc>
-          <w:tcPr>
-            <w:tcW w:type="dxa" w:w="1304"/>
-          </w:tcPr>
-          <w:p>
-            <w:r/>
-            <w:r>
-              <w:rPr>
-                <w:b w:val="0"/>
-                <w:i w:val="0"/>
-                <w:sz w:val="16"/>
-              </w:rPr>
-              <w:t>0</w:t>
-            </w:r>
-          </w:p>
-        </w:tc>
-        <w:tc>
-          <w:tcPr>
-            <w:tcW w:type="dxa" w:w="1304"/>
-          </w:tcPr>
-          <w:p>
-            <w:r/>
-            <w:r>
-              <w:rPr>
-                <w:b w:val="0"/>
-                <w:i w:val="0"/>
-                <w:sz w:val="16"/>
-              </w:rPr>
-              <w:t>1</w:t>
+                <w:sz w:val="15"/>
+              </w:rPr>
+              <w:t>3</w:t>
             </w:r>
           </w:p>
         </w:tc>
@@ -1247,7 +1357,7 @@
       <w:tr>
         <w:tc>
           <w:tcPr>
-            <w:tcW w:type="dxa" w:w="2948"/>
+            <w:tcW w:type="dxa" w:w="2835"/>
             <w:shd w:val="clear" w:color="auto" w:fill="F2F5F9"/>
           </w:tcPr>
           <w:p>
@@ -1256,60 +1366,9 @@
               <w:rPr>
                 <w:b w:val="0"/>
                 <w:i w:val="0"/>
-                <w:sz w:val="16"/>
-              </w:rPr>
-              <w:t>+20% — up to twice the target</w:t>
-            </w:r>
-          </w:p>
-        </w:tc>
-        <w:tc>
-          <w:tcPr>
-            <w:tcW w:type="dxa" w:w="907"/>
-            <w:shd w:val="clear" w:color="auto" w:fill="F2F5F9"/>
-          </w:tcPr>
-          <w:p>
-            <w:r/>
-            <w:r>
-              <w:rPr>
-                <w:b w:val="0"/>
-                <w:i w:val="0"/>
-                <w:sz w:val="16"/>
-              </w:rPr>
-              <w:t>1</w:t>
-            </w:r>
-          </w:p>
-        </w:tc>
-        <w:tc>
-          <w:tcPr>
-            <w:tcW w:type="dxa" w:w="1020"/>
-            <w:shd w:val="clear" w:color="auto" w:fill="F2F5F9"/>
-          </w:tcPr>
-          <w:p>
-            <w:r/>
-            <w:r>
-              <w:rPr>
-                <w:b w:val="0"/>
-                <w:i w:val="0"/>
-                <w:sz w:val="16"/>
-              </w:rPr>
-              <w:t>0</w:t>
-            </w:r>
-          </w:p>
-        </w:tc>
-        <w:tc>
-          <w:tcPr>
-            <w:tcW w:type="dxa" w:w="907"/>
-            <w:shd w:val="clear" w:color="auto" w:fill="F2F5F9"/>
-          </w:tcPr>
-          <w:p>
-            <w:r/>
-            <w:r>
-              <w:rPr>
-                <w:b w:val="0"/>
-                <w:i w:val="0"/>
-                <w:sz w:val="16"/>
-              </w:rPr>
-              <w:t>0</w:t>
+                <w:sz w:val="15"/>
+              </w:rPr>
+              <w:t>+20% — 30–70% delivered (or no requirement on file)</w:t>
             </w:r>
           </w:p>
         </w:tc>
@@ -1324,7 +1383,58 @@
               <w:rPr>
                 <w:b w:val="0"/>
                 <w:i w:val="0"/>
-                <w:sz w:val="16"/>
+                <w:sz w:val="15"/>
+              </w:rPr>
+              <w:t>20</w:t>
+            </w:r>
+          </w:p>
+        </w:tc>
+        <w:tc>
+          <w:tcPr>
+            <w:tcW w:type="dxa" w:w="850"/>
+            <w:shd w:val="clear" w:color="auto" w:fill="F2F5F9"/>
+          </w:tcPr>
+          <w:p>
+            <w:r/>
+            <w:r>
+              <w:rPr>
+                <w:b w:val="0"/>
+                <w:i w:val="0"/>
+                <w:sz w:val="15"/>
+              </w:rPr>
+              <w:t>11</w:t>
+            </w:r>
+          </w:p>
+        </w:tc>
+        <w:tc>
+          <w:tcPr>
+            <w:tcW w:type="dxa" w:w="850"/>
+            <w:shd w:val="clear" w:color="auto" w:fill="F2F5F9"/>
+          </w:tcPr>
+          <w:p>
+            <w:r/>
+            <w:r>
+              <w:rPr>
+                <w:b w:val="0"/>
+                <w:i w:val="0"/>
+                <w:sz w:val="15"/>
+              </w:rPr>
+              <w:t>6</w:t>
+            </w:r>
+          </w:p>
+        </w:tc>
+        <w:tc>
+          <w:tcPr>
+            <w:tcW w:type="dxa" w:w="794"/>
+            <w:shd w:val="clear" w:color="auto" w:fill="F2F5F9"/>
+          </w:tcPr>
+          <w:p>
+            <w:r/>
+            <w:r>
+              <w:rPr>
+                <w:b w:val="0"/>
+                <w:i w:val="0"/>
+                <w:sz w:val="15"/>
               </w:rPr>
               <w:t>0</w:t>
             </w:r>
@@ -1332,7 +1442,7 @@
         </w:tc>
         <w:tc>
           <w:tcPr>
-            <w:tcW w:type="dxa" w:w="1304"/>
+            <w:tcW w:type="dxa" w:w="1247"/>
             <w:shd w:val="clear" w:color="auto" w:fill="F2F5F9"/>
           </w:tcPr>
           <w:p>
@@ -1341,7 +1451,7 @@
               <w:rPr>
                 <w:b w:val="0"/>
                 <w:i w:val="0"/>
-                <w:sz w:val="16"/>
+                <w:sz w:val="15"/>
               </w:rPr>
               <w:t>1</w:t>
             </w:r>
@@ -1349,7 +1459,7 @@
         </w:tc>
         <w:tc>
           <w:tcPr>
-            <w:tcW w:type="dxa" w:w="1304"/>
+            <w:tcW w:type="dxa" w:w="1134"/>
             <w:shd w:val="clear" w:color="auto" w:fill="F2F5F9"/>
           </w:tcPr>
           <w:p>
@@ -1358,9 +1468,26 @@
               <w:rPr>
                 <w:b w:val="0"/>
                 <w:i w:val="0"/>
-                <w:sz w:val="16"/>
-              </w:rPr>
-              <w:t>0</w:t>
+                <w:sz w:val="15"/>
+              </w:rPr>
+              <w:t>$11</w:t>
+            </w:r>
+          </w:p>
+        </w:tc>
+        <w:tc>
+          <w:tcPr>
+            <w:tcW w:type="dxa" w:w="794"/>
+            <w:shd w:val="clear" w:color="auto" w:fill="F2F5F9"/>
+          </w:tcPr>
+          <w:p>
+            <w:r/>
+            <w:r>
+              <w:rPr>
+                <w:b w:val="0"/>
+                <w:i w:val="0"/>
+                <w:sz w:val="15"/>
+              </w:rPr>
+              <w:t>2</w:t>
             </w:r>
           </w:p>
         </w:tc>
@@ -1368,63 +1495,95 @@
       <w:tr>
         <w:tc>
           <w:tcPr>
-            <w:tcW w:type="dxa" w:w="2948"/>
-          </w:tcPr>
-          <w:p>
-            <w:r/>
-            <w:r>
-              <w:rPr>
-                <w:b w:val="0"/>
-                <w:i w:val="0"/>
-                <w:sz w:val="16"/>
-              </w:rPr>
-              <w:t>+30% — further than twice the target</w:t>
-            </w:r>
-          </w:p>
-        </w:tc>
-        <w:tc>
-          <w:tcPr>
-            <w:tcW w:type="dxa" w:w="907"/>
-          </w:tcPr>
-          <w:p>
-            <w:r/>
-            <w:r>
-              <w:rPr>
-                <w:b w:val="0"/>
-                <w:i w:val="0"/>
-                <w:sz w:val="16"/>
-              </w:rPr>
-              <w:t>52</w:t>
-            </w:r>
-          </w:p>
-        </w:tc>
-        <w:tc>
-          <w:tcPr>
-            <w:tcW w:type="dxa" w:w="1020"/>
-          </w:tcPr>
-          <w:p>
-            <w:r/>
-            <w:r>
-              <w:rPr>
-                <w:b w:val="0"/>
-                <w:i w:val="0"/>
-                <w:sz w:val="16"/>
-              </w:rPr>
-              <w:t>33</w:t>
-            </w:r>
-          </w:p>
-        </w:tc>
-        <w:tc>
-          <w:tcPr>
-            <w:tcW w:type="dxa" w:w="907"/>
-          </w:tcPr>
-          <w:p>
-            <w:r/>
-            <w:r>
-              <w:rPr>
-                <w:b w:val="0"/>
-                <w:i w:val="0"/>
-                <w:sz w:val="16"/>
+            <w:tcW w:type="dxa" w:w="2835"/>
+          </w:tcPr>
+          <w:p>
+            <w:r/>
+            <w:r>
+              <w:rPr>
+                <w:b w:val="0"/>
+                <w:i w:val="0"/>
+                <w:sz w:val="15"/>
+              </w:rPr>
+              <w:t>+15% — +30% halved: share did not rise after the last raise</w:t>
+            </w:r>
+          </w:p>
+        </w:tc>
+        <w:tc>
+          <w:tcPr>
+            <w:tcW w:type="dxa" w:w="794"/>
+          </w:tcPr>
+          <w:p>
+            <w:r/>
+            <w:r>
+              <w:rPr>
+                <w:b w:val="0"/>
+                <w:i w:val="0"/>
+                <w:sz w:val="15"/>
+              </w:rPr>
+              <w:t>12</w:t>
+            </w:r>
+          </w:p>
+        </w:tc>
+        <w:tc>
+          <w:tcPr>
+            <w:tcW w:type="dxa" w:w="850"/>
+          </w:tcPr>
+          <w:p>
+            <w:r/>
+            <w:r>
+              <w:rPr>
+                <w:b w:val="0"/>
+                <w:i w:val="0"/>
+                <w:sz w:val="15"/>
+              </w:rPr>
+              <w:t>9</w:t>
+            </w:r>
+          </w:p>
+        </w:tc>
+        <w:tc>
+          <w:tcPr>
+            <w:tcW w:type="dxa" w:w="850"/>
+          </w:tcPr>
+          <w:p>
+            <w:r/>
+            <w:r>
+              <w:rPr>
+                <w:b w:val="0"/>
+                <w:i w:val="0"/>
+                <w:sz w:val="15"/>
+              </w:rPr>
+              <w:t>3</w:t>
+            </w:r>
+          </w:p>
+        </w:tc>
+        <w:tc>
+          <w:tcPr>
+            <w:tcW w:type="dxa" w:w="794"/>
+          </w:tcPr>
+          <w:p>
+            <w:r/>
+            <w:r>
+              <w:rPr>
+                <w:b w:val="0"/>
+                <w:i w:val="0"/>
+                <w:sz w:val="15"/>
+              </w:rPr>
+              <w:t>0</w:t>
+            </w:r>
+          </w:p>
+        </w:tc>
+        <w:tc>
+          <w:tcPr>
+            <w:tcW w:type="dxa" w:w="1247"/>
+          </w:tcPr>
+          <w:p>
+            <w:r/>
+            <w:r>
+              <w:rPr>
+                <w:b w:val="0"/>
+                <w:i w:val="0"/>
+                <w:sz w:val="15"/>
               </w:rPr>
               <w:t>1</w:t>
             </w:r>
@@ -1432,6 +1591,22 @@
         </w:tc>
         <w:tc>
           <w:tcPr>
+            <w:tcW w:type="dxa" w:w="1134"/>
+          </w:tcPr>
+          <w:p>
+            <w:r/>
+            <w:r>
+              <w:rPr>
+                <w:b w:val="0"/>
+                <w:i w:val="0"/>
+                <w:sz w:val="15"/>
+              </w:rPr>
+              <w:t>$10</w:t>
+            </w:r>
+          </w:p>
+        </w:tc>
+        <w:tc>
+          <w:tcPr>
             <w:tcW w:type="dxa" w:w="794"/>
           </w:tcPr>
           <w:p>
@@ -1440,41 +1615,9 @@
               <w:rPr>
                 <w:b w:val="0"/>
                 <w:i w:val="0"/>
-                <w:sz w:val="16"/>
-              </w:rPr>
-              <w:t>14</w:t>
-            </w:r>
-          </w:p>
-        </w:tc>
-        <w:tc>
-          <w:tcPr>
-            <w:tcW w:type="dxa" w:w="1304"/>
-          </w:tcPr>
-          <w:p>
-            <w:r/>
-            <w:r>
-              <w:rPr>
-                <w:b w:val="0"/>
-                <w:i w:val="0"/>
-                <w:sz w:val="16"/>
-              </w:rPr>
-              <w:t>1</w:t>
-            </w:r>
-          </w:p>
-        </w:tc>
-        <w:tc>
-          <w:tcPr>
-            <w:tcW w:type="dxa" w:w="1304"/>
-          </w:tcPr>
-          <w:p>
-            <w:r/>
-            <w:r>
-              <w:rPr>
-                <w:b w:val="0"/>
-                <w:i w:val="0"/>
-                <w:sz w:val="16"/>
-              </w:rPr>
-              <w:t>5</w:t>
+                <w:sz w:val="15"/>
+              </w:rPr>
+              <w:t>0</w:t>
             </w:r>
           </w:p>
         </w:tc>
@@ -1482,7 +1625,7 @@
       <w:tr>
         <w:tc>
           <w:tcPr>
-            <w:tcW w:type="dxa" w:w="2948"/>
+            <w:tcW w:type="dxa" w:w="2835"/>
             <w:shd w:val="clear" w:color="auto" w:fill="F2F5F9"/>
           </w:tcPr>
           <w:p>
@@ -1491,60 +1634,9 @@
               <w:rPr>
                 <w:b w:val="0"/>
                 <w:i w:val="0"/>
-                <w:sz w:val="16"/>
-              </w:rPr>
-              <w:t>+25% — no rank read on file</w:t>
-            </w:r>
-          </w:p>
-        </w:tc>
-        <w:tc>
-          <w:tcPr>
-            <w:tcW w:type="dxa" w:w="907"/>
-            <w:shd w:val="clear" w:color="auto" w:fill="F2F5F9"/>
-          </w:tcPr>
-          <w:p>
-            <w:r/>
-            <w:r>
-              <w:rPr>
-                <w:b w:val="0"/>
-                <w:i w:val="0"/>
-                <w:sz w:val="16"/>
-              </w:rPr>
-              <w:t>32</w:t>
-            </w:r>
-          </w:p>
-        </w:tc>
-        <w:tc>
-          <w:tcPr>
-            <w:tcW w:type="dxa" w:w="1020"/>
-            <w:shd w:val="clear" w:color="auto" w:fill="F2F5F9"/>
-          </w:tcPr>
-          <w:p>
-            <w:r/>
-            <w:r>
-              <w:rPr>
-                <w:b w:val="0"/>
-                <w:i w:val="0"/>
-                <w:sz w:val="16"/>
-              </w:rPr>
-              <w:t>14</w:t>
-            </w:r>
-          </w:p>
-        </w:tc>
-        <w:tc>
-          <w:tcPr>
-            <w:tcW w:type="dxa" w:w="907"/>
-            <w:shd w:val="clear" w:color="auto" w:fill="F2F5F9"/>
-          </w:tcPr>
-          <w:p>
-            <w:r/>
-            <w:r>
-              <w:rPr>
-                <w:b w:val="0"/>
-                <w:i w:val="0"/>
-                <w:sz w:val="16"/>
-              </w:rPr>
-              <w:t>1</w:t>
+                <w:sz w:val="15"/>
+              </w:rPr>
+              <w:t>+10% — over 70% delivered, or +20% halved</w:t>
             </w:r>
           </w:p>
         </w:tc>
@@ -1559,15 +1651,15 @@
               <w:rPr>
                 <w:b w:val="0"/>
                 <w:i w:val="0"/>
-                <w:sz w:val="16"/>
-              </w:rPr>
-              <w:t>14</w:t>
-            </w:r>
-          </w:p>
-        </w:tc>
-        <w:tc>
-          <w:tcPr>
-            <w:tcW w:type="dxa" w:w="1304"/>
+                <w:sz w:val="15"/>
+              </w:rPr>
+              <w:t>7</w:t>
+            </w:r>
+          </w:p>
+        </w:tc>
+        <w:tc>
+          <w:tcPr>
+            <w:tcW w:type="dxa" w:w="850"/>
             <w:shd w:val="clear" w:color="auto" w:fill="F2F5F9"/>
           </w:tcPr>
           <w:p>
@@ -1576,7 +1668,7 @@
               <w:rPr>
                 <w:b w:val="0"/>
                 <w:i w:val="0"/>
-                <w:sz w:val="16"/>
+                <w:sz w:val="15"/>
               </w:rPr>
               <w:t>2</w:t>
             </w:r>
@@ -1584,7 +1676,7 @@
         </w:tc>
         <w:tc>
           <w:tcPr>
-            <w:tcW w:type="dxa" w:w="1304"/>
+            <w:tcW w:type="dxa" w:w="850"/>
             <w:shd w:val="clear" w:color="auto" w:fill="F2F5F9"/>
           </w:tcPr>
           <w:p>
@@ -1593,9 +1685,207 @@
               <w:rPr>
                 <w:b w:val="0"/>
                 <w:i w:val="0"/>
-                <w:sz w:val="16"/>
+                <w:sz w:val="15"/>
+              </w:rPr>
+              <w:t>4</w:t>
+            </w:r>
+          </w:p>
+        </w:tc>
+        <w:tc>
+          <w:tcPr>
+            <w:tcW w:type="dxa" w:w="794"/>
+            <w:shd w:val="clear" w:color="auto" w:fill="F2F5F9"/>
+          </w:tcPr>
+          <w:p>
+            <w:r/>
+            <w:r>
+              <w:rPr>
+                <w:b w:val="0"/>
+                <w:i w:val="0"/>
+                <w:sz w:val="15"/>
+              </w:rPr>
+              <w:t>0</w:t>
+            </w:r>
+          </w:p>
+        </w:tc>
+        <w:tc>
+          <w:tcPr>
+            <w:tcW w:type="dxa" w:w="1247"/>
+            <w:shd w:val="clear" w:color="auto" w:fill="F2F5F9"/>
+          </w:tcPr>
+          <w:p>
+            <w:r/>
+            <w:r>
+              <w:rPr>
+                <w:b w:val="0"/>
+                <w:i w:val="0"/>
+                <w:sz w:val="15"/>
+              </w:rPr>
+              <w:t>0</w:t>
+            </w:r>
+          </w:p>
+        </w:tc>
+        <w:tc>
+          <w:tcPr>
+            <w:tcW w:type="dxa" w:w="1134"/>
+            <w:shd w:val="clear" w:color="auto" w:fill="F2F5F9"/>
+          </w:tcPr>
+          <w:p>
+            <w:r/>
+            <w:r>
+              <w:rPr>
+                <w:b w:val="0"/>
+                <w:i w:val="0"/>
+                <w:sz w:val="15"/>
+              </w:rPr>
+              <w:t>$11</w:t>
+            </w:r>
+          </w:p>
+        </w:tc>
+        <w:tc>
+          <w:tcPr>
+            <w:tcW w:type="dxa" w:w="794"/>
+            <w:shd w:val="clear" w:color="auto" w:fill="F2F5F9"/>
+          </w:tcPr>
+          <w:p>
+            <w:r/>
+            <w:r>
+              <w:rPr>
+                <w:b w:val="0"/>
+                <w:i w:val="0"/>
+                <w:sz w:val="15"/>
               </w:rPr>
               <w:t>1</w:t>
+            </w:r>
+          </w:p>
+        </w:tc>
+      </w:tr>
+      <w:tr>
+        <w:tc>
+          <w:tcPr>
+            <w:tcW w:type="dxa" w:w="2835"/>
+          </w:tcPr>
+          <w:p>
+            <w:r/>
+            <w:r>
+              <w:rPr>
+                <w:b w:val="0"/>
+                <w:i w:val="0"/>
+                <w:sz w:val="15"/>
+              </w:rPr>
+              <w:t>No step — at requirement, share stop or loss stop</w:t>
+            </w:r>
+          </w:p>
+        </w:tc>
+        <w:tc>
+          <w:tcPr>
+            <w:tcW w:type="dxa" w:w="794"/>
+          </w:tcPr>
+          <w:p>
+            <w:r/>
+            <w:r>
+              <w:rPr>
+                <w:b w:val="0"/>
+                <w:i w:val="0"/>
+                <w:sz w:val="15"/>
+              </w:rPr>
+              <w:t>2</w:t>
+            </w:r>
+          </w:p>
+        </w:tc>
+        <w:tc>
+          <w:tcPr>
+            <w:tcW w:type="dxa" w:w="850"/>
+          </w:tcPr>
+          <w:p>
+            <w:r/>
+            <w:r>
+              <w:rPr>
+                <w:b w:val="0"/>
+                <w:i w:val="0"/>
+                <w:sz w:val="15"/>
+              </w:rPr>
+              <w:t>0</w:t>
+            </w:r>
+          </w:p>
+        </w:tc>
+        <w:tc>
+          <w:tcPr>
+            <w:tcW w:type="dxa" w:w="850"/>
+          </w:tcPr>
+          <w:p>
+            <w:r/>
+            <w:r>
+              <w:rPr>
+                <w:b w:val="0"/>
+                <w:i w:val="0"/>
+                <w:sz w:val="15"/>
+              </w:rPr>
+              <w:t>1</w:t>
+            </w:r>
+          </w:p>
+        </w:tc>
+        <w:tc>
+          <w:tcPr>
+            <w:tcW w:type="dxa" w:w="794"/>
+          </w:tcPr>
+          <w:p>
+            <w:r/>
+            <w:r>
+              <w:rPr>
+                <w:b w:val="0"/>
+                <w:i w:val="0"/>
+                <w:sz w:val="15"/>
+              </w:rPr>
+              <w:t>0</w:t>
+            </w:r>
+          </w:p>
+        </w:tc>
+        <w:tc>
+          <w:tcPr>
+            <w:tcW w:type="dxa" w:w="1247"/>
+          </w:tcPr>
+          <w:p>
+            <w:r/>
+            <w:r>
+              <w:rPr>
+                <w:b w:val="0"/>
+                <w:i w:val="0"/>
+                <w:sz w:val="15"/>
+              </w:rPr>
+              <w:t>0</w:t>
+            </w:r>
+          </w:p>
+        </w:tc>
+        <w:tc>
+          <w:tcPr>
+            <w:tcW w:type="dxa" w:w="1134"/>
+          </w:tcPr>
+          <w:p>
+            <w:r/>
+            <w:r>
+              <w:rPr>
+                <w:b w:val="0"/>
+                <w:i w:val="0"/>
+                <w:sz w:val="15"/>
+              </w:rPr>
+              <w:t>$26</w:t>
+            </w:r>
+          </w:p>
+        </w:tc>
+        <w:tc>
+          <w:tcPr>
+            <w:tcW w:type="dxa" w:w="794"/>
+          </w:tcPr>
+          <w:p>
+            <w:r/>
+            <w:r>
+              <w:rPr>
+                <w:b w:val="0"/>
+                <w:i w:val="0"/>
+                <w:sz w:val="15"/>
+              </w:rPr>
+              <w:t>2</w:t>
             </w:r>
           </w:p>
         </w:tc>
@@ -1605,6 +1895,39 @@
       <w:pPr>
         <w:spacing w:after="40"/>
       </w:pPr>
+    </w:p>
+    <w:p>
+      <w:pPr>
+        <w:spacing w:after="100"/>
+      </w:pPr>
+      <w:r>
+        <w:rPr>
+          <w:b/>
+          <w:color w:val="1F3A5F"/>
+        </w:rPr>
+        <w:t xml:space="preserve">The envelope. </w:t>
+      </w:r>
+      <w:r>
+        <w:rPr>
+          <w:b w:val="0"/>
+          <w:i w:val="0"/>
+        </w:rPr>
+        <w:t xml:space="preserve">These campaigns spent $594 a day in the deal so far. The push runs inside 1.5× that for 09-24 → 09-28: </w:t>
+      </w:r>
+      <w:r>
+        <w:rPr>
+          <w:b/>
+          <w:i w:val="0"/>
+        </w:rPr>
+        <w:t>$4,457</w:t>
+      </w:r>
+      <w:r>
+        <w:rPr>
+          <w:b w:val="0"/>
+          <w:i w:val="0"/>
+        </w:rPr>
+        <w:t xml:space="preserve"> in total ($891 a day). At the new prices with clicks unchanged they would spend about $774 a day; every click the push adds comes on top, so the envelope — not a price cap — is what ends an over-running push. The loss per order is computed on the full top-of-search price; what Amazon charges is at or below it, so it is an upper bound.</w:t>
+      </w:r>
     </w:p>
     <w:p>
       <w:pPr>
@@ -1675,25 +1998,6 @@
         <w:rPr>
           <w:b/>
         </w:rPr>
-        <w:t>Bamboo King Size Sheets Set-[Bamboo|King]-(LSV)-Exact-(Ranking)-DO-BAMBOO-KING-WHITE</w:t>
-      </w:r>
-      <w:r>
-        <w:rPr>
-          <w:b w:val="0"/>
-          <w:i w:val="0"/>
-        </w:rPr>
-        <w:t xml:space="preserve"> — rank 23 → 12 in thirty days, target 8. 90 days: 13 clicks — 13 top of search, 0 product pages, 0 rest of search (100% / 0% / 0%), 2 orders. Last 14 days: 14 clicks — 14 top of search, 0 product pages, 0 rest of search (100% / 0% / 0%). In the deal (09-15 → 09-22): 13 top-of-search clicks (1.6/day, against 0.0/day before it); last 3 days 3 clicks. Plan needs 9 paid clicks a week (1.3/day). Top-of-search impression share 12.32%. Budget $11.01/day, last 7 days 102% used. The run holds it. Correction: +10% (rank 12 vs target 8: within 5 positions → +10%) — TOS $8.27 → $9.10; modifier 364%; budget $11.01 → $14.31.</w:t>
-      </w:r>
-    </w:p>
-    <w:p>
-      <w:pPr>
-        <w:spacing w:after="100"/>
-        <w:ind w:left="227"/>
-      </w:pPr>
-      <w:r>
-        <w:rPr>
-          <w:b/>
-        </w:rPr>
         <w:t>100 Bamboo Sheets Queen-(VLSV)-Exact-(Ranking)-DO-BAMBOO-QUEEN-OLIVE</w:t>
       </w:r>
       <w:r>
@@ -1701,7 +2005,7 @@
           <w:b w:val="0"/>
           <w:i w:val="0"/>
         </w:rPr>
-        <w:t xml:space="preserve"> — no rank on file. 90 days: 14 clicks — 13 top of search, 0 product pages, 1 rest of search (93% / 0% / 7%), 1 orders. Last 14 days: 10 clicks — 10 top of search, 0 product pages, 0 rest of search (100% / 0% / 0%). In the deal (09-15 → 09-22): 8 top-of-search clicks (1.0/day, against 0.2/day before it); last 3 days 4 clicks. Budget $5.00/day, last 7 days 163% used. The run holds it. Correction: +25% (no rank read on file → +25%) — TOS $9.10 → $11.38; modifier 355%; budget $5.00 → $6.50.</w:t>
+        <w:t xml:space="preserve"> — no rank on file. 90 days: 14 clicks — 13 top of search, 0 product pages, 1 rest of search (93% / 0% / 7%), 1 orders. Last 14 days: 10 clicks — 10 top of search, 0 product pages, 0 rest of search (100% / 0% / 0%). In the deal (09-15 → 09-22): 8 top-of-search clicks (1.0/day, against 0.2/day before it); last 3 days 4 clicks. Budget $5.00/day, last 7 days 163% used. The run holds it. Correction: +20% (no click requirement on file → +20% (a stated departure: the logic document would hold at the ceiling)) — TOS $9.10 → $10.92; a top-of-search order then costs up to $70 (a loss of $45 against $25.40 contribution; stop at $11.84); impression share 9.3% → 13.1% in the deal; modifier 337%; budget $5.00 → $6.50.</w:t>
       </w:r>
     </w:p>
     <w:p>
@@ -1720,7 +2024,26 @@
           <w:b w:val="0"/>
           <w:i w:val="0"/>
         </w:rPr>
-        <w:t xml:space="preserve"> — no rank on file. 90 days: 13 clicks — 12 top of search, 0 product pages, 1 rest of search (92% / 0% / 8%), 2 orders. Last 14 days: 9 clicks — 9 top of search, 0 product pages, 0 rest of search (100% / 0% / 0%). In the deal (09-15 → 09-22): 4 top-of-search clicks (0.5/day, against 0.3/day before it); last 3 days 1 clicks. Plan needs 17 paid clicks a week (2.4/day). Top-of-search impression share 22.33%. Budget $10.00/day, last 7 days 29% used. The run holds it. Correction: +25% (no rank read on file → +25%) — TOS $10.41 → $13.01; modifier 334%.</w:t>
+        <w:t xml:space="preserve"> — no rank on file. 90 days: 13 clicks — 12 top of search, 0 product pages, 1 rest of search (92% / 0% / 8%), 2 orders. Last 14 days: 9 clicks — 9 top of search, 0 product pages, 0 rest of search (100% / 0% / 0%). In the deal (09-15 → 09-22): 4 top-of-search clicks (0.5/day, against 0.3/day before it); last 3 days 1 clicks. Plan needs 17 paid clicks a week (2.4/day). Top-of-search impression share 22.33%. Budget $10.00/day, last 7 days 29% used. The run holds it. Correction: +20% (31% of required top-of-search clicks delivered → +20%) — TOS $10.41 → $12.49; a top-of-search order then costs up to $80 (a loss of $53 against $27.09 contribution; stop at $12.63); impression share 26.1% → 31.3% in the deal; the requirement is above what the whole auction holds — grade on share; modifier 316%.</w:t>
+      </w:r>
+    </w:p>
+    <w:p>
+      <w:pPr>
+        <w:spacing w:after="100"/>
+        <w:ind w:left="227"/>
+      </w:pPr>
+      <w:r>
+        <w:rPr>
+          <w:b/>
+        </w:rPr>
+        <w:t>King Size Bamboo Sheets-[Bamboo|King]-(LSV)-Exact-(Ranking)-DO-BAMBOO-KING-WHITE</w:t>
+      </w:r>
+      <w:r>
+        <w:rPr>
+          <w:b w:val="0"/>
+          <w:i w:val="0"/>
+        </w:rPr>
+        <w:t xml:space="preserve"> — rank 21 → 28 in thirty days, target 11. 90 days: 6 clicks — 6 top of search, 0 product pages, 0 rest of search (100% / 0% / 0%), 0 orders. Last 14 days: 7 clicks — 7 top of search, 0 product pages, 0 rest of search (100% / 0% / 0%). In the deal (09-15 → 09-22): 7 top-of-search clicks (0.9/day, against 0.0/day before it); last 3 days 2 clicks. Plan needs 7 paid clicks a week (1.0/day). Budget $27.00/day, last 7 days 24% used. The run holds it. Correction: +10% (88% of required top-of-search clicks delivered → +10%) — TOS $6.60 → $7.26; a top-of-search order then costs up to $47 (a loss of $20 against $27.09 contribution; stop at $12.63); impression share 4.0% → 4.7% in the deal; modifier 384%.</w:t>
       </w:r>
     </w:p>
     <w:p>
@@ -1739,7 +2062,7 @@
           <w:b w:val="0"/>
           <w:i w:val="0"/>
         </w:rPr>
-        <w:t>Push all 73 by the rank-gap step. 7 have taken no click in 90 days or in the deal — if still zero after two daily steps, check the ad, the child and the listing while the push continues. Reverse every cut or hold the run wrote on these.</w:t>
+        <w:t>Push all 73 by the delivery-gap step, inside the loss stop. 7 have taken no click in 90 days or in the deal — if still zero after two daily steps, check the ad, the child and the listing while the push continues. Reverse every cut or hold the run wrote on these.</w:t>
       </w:r>
     </w:p>
     <w:p>
@@ -1747,7 +2070,7 @@
         <w:pStyle w:val="Heading1"/>
       </w:pPr>
       <w:r>
-        <w:t>A3. 5 in-focus campaigns with the right mix, short of their clicks</w:t>
+        <w:t>A3. 6 in-focus campaigns with the right mix, short of their clicks</w:t>
       </w:r>
     </w:p>
     <w:p>
@@ -1766,7 +2089,7 @@
           <w:b w:val="0"/>
           <w:i w:val="0"/>
         </w:rPr>
-        <w:t>Where 70%+ of clicks already land at top of search and delivery is short of the requirement, the lever is the top-of-search price — and the budget where it is running out. Both move in the same write. Impression share already high is not a reason to stop during the deal: the requirement is not met, so push to it, then evaluate cost per click.</w:t>
+        <w:t>Where 70%+ of clicks already land at top of search and delivery is short of the requirement, the lever is the top-of-search price — and the budget where it is running out. Both move in the same write. Impression share is the live read: rising with price means keep stepping; at 40% or more and flat means the requirement is overstated and the push stops (none is there today — share is 1–6% on almost every row).</w:t>
       </w:r>
     </w:p>
     <w:p>
@@ -1804,7 +2127,7 @@
           <w:b w:val="0"/>
           <w:i w:val="0"/>
         </w:rPr>
-        <w:t xml:space="preserve"> — rank 45 → 24 in thirty days, target 10. 90 days: 3673 clicks — 2476 top of search, 991 product pages, 206 rest of search (67% / 27% / 6%), 463 orders. Last 14 days: 532 clicks — 513 top of search, 17 product pages, 2 rest of search (96% / 3% / 0%). In the deal (09-15 → 09-22): 376 top-of-search clicks (47.0/day, against 27.1/day before it); last 3 days 149 clicks. Plan needs 1285 paid clicks a week (183.6/day). Top-of-search impression share 3.36%. Budget $272.36/day, last 7 days 127% used. The run holds it. Correction: +30% (rank 24 vs target 10: more than 2× the target → +30%) — TOS $7.42 → $9.65; modifier 419%; budget $272.36 → $354.07.</w:t>
+        <w:t xml:space="preserve"> — rank 29 → 33 in thirty days, target 10. 90 days: 3673 clicks — 2476 top of search, 991 product pages, 206 rest of search (67% / 27% / 6%), 463 orders. Last 14 days: 532 clicks — 513 top of search, 17 product pages, 2 rest of search (96% / 3% / 0%). In the deal (09-15 → 09-22): 376 top-of-search clicks (47.0/day, against 27.1/day before it); last 3 days 149 clicks. Plan needs 1285 paid clicks a week (183.6/day). Top-of-search impression share 3.36%. Budget $272.36/day, last 7 days 127% used. The run holds it. Correction: +30% (26% of required top-of-search clicks delivered → +30%) — TOS $7.42 → $9.65; a top-of-search order then costs up to $75 (a loss of $48 against $27.09 contribution; stop at $10.47); impression share 3.2% → 5.5% in the deal; modifier 419%; budget $272.36 → $354.07.</w:t>
       </w:r>
     </w:p>
     <w:p>
@@ -1823,7 +2146,7 @@
           <w:b w:val="0"/>
           <w:i w:val="0"/>
         </w:rPr>
-        <w:t xml:space="preserve"> — rank 32 → 24 in thirty days, target 8. 90 days: 44 clicks — 39 top of search, 4 product pages, 1 rest of search (89% / 9% / 2%), 7 orders. Last 14 days: 52 clicks — 46 top of search, 5 product pages, 1 rest of search (88% / 10% / 2%). In the deal (09-15 → 09-22): 41 top-of-search clicks (5.1/day, against 0.3/day before it); last 3 days 19 clicks. Plan needs 351 paid clicks a week (50.1/day). Top-of-search impression share 2.93%. Budget $35.00/day, last 7 days 91% used. The run holds it. Correction: +30% (rank 24 vs target 8: more than 2× the target → +30%) — TOS $6.41 → $8.33; modifier 343%; budget $35.00 → $45.50.</w:t>
+        <w:t xml:space="preserve"> — rank 19 → 25 in thirty days, target 8. 90 days: 44 clicks — 39 top of search, 4 product pages, 1 rest of search (89% / 9% / 2%), 7 orders. Last 14 days: 52 clicks — 46 top of search, 5 product pages, 1 rest of search (88% / 10% / 2%). In the deal (09-15 → 09-22): 41 top-of-search clicks (5.1/day, against 0.3/day before it); last 3 days 19 clicks. Plan needs 351 paid clicks a week (50.1/day). Top-of-search impression share 2.93%. Budget $35.00/day, last 7 days 91% used. The run holds it. Correction: +30% (10% of required top-of-search clicks delivered → +30%) — TOS $6.41 → $8.33; a top-of-search order then costs up to $46 (a loss of $19 against $27.09 contribution; stop at $14.59); impression share 2.9% → 3.6% in the deal; modifier 343%; budget $35.00 → $45.50.</w:t>
       </w:r>
     </w:p>
     <w:p>
@@ -1835,14 +2158,14 @@
         <w:rPr>
           <w:b/>
         </w:rPr>
-        <w:t>Bamboo Sheets King Deep Pocket-(VLSV)-Exact-(Ranking)-DO-BAMBOO-KING-CREME</w:t>
+        <w:t>King Cooling Sheets-[Cooling|King]-(MSV)-Exact-(Ranking)-DO-BAMBOO-KING-WHITE</w:t>
       </w:r>
       <w:r>
         <w:rPr>
           <w:b w:val="0"/>
           <w:i w:val="0"/>
         </w:rPr>
-        <w:t xml:space="preserve"> — no rank on file. 90 days: 29 clicks — 24 top of search, 3 product pages, 2 rest of search (83% / 10% / 7%), 2 orders. Last 14 days: 21 clicks — 15 top of search, 3 product pages, 3 rest of search (71% / 14% / 14%). In the deal (09-15 → 09-22): 10 top-of-search clicks (1.2/day, against 0.5/day before it); last 3 days 4 clicks. Top-of-search impression share 3.64%. Budget $15.77/day, last 7 days 72% used. Top of search converts 13.3% against a market 3.77%. The run writes modifier 160% → 178%, base $3.00 → $2.81, budget $15.77 → $20.50 — top-of-search price $7.80 → $7.81. Correction: +25% (no rank read on file → +25%) — TOS $7.80 → $9.75; modifier 225%.</w:t>
+        <w:t xml:space="preserve"> — rank 53 → 48 in thirty days, target 12. 90 days: 252 clicks — 180 top of search, 41 product pages, 31 rest of search (71% / 16% / 12%), 38 orders. Last 14 days: 21 clicks — 21 top of search, 0 product pages, 0 rest of search (100% / 0% / 0%). In the deal (09-15 → 09-22): 17 top-of-search clicks (2.1/day, against 0.9/day before it); last 3 days 5 clicks. Plan needs 19 paid clicks a week (2.7/day). Top-of-search impression share 4.35%. Budget $13.00/day, last 7 days 106% used. The run writes budget $13.00 → $16.90. Correction: +10% (78% of required top-of-search clicks delivered → +10%) — TOS $5.93 → $6.52; a top-of-search order then costs up to $38 (a loss of $11 against $27.09 contribution; stop at $14.00); impression share 2.2% → 4.0% in the deal; modifier 443%; budget $13.00 → $16.90.</w:t>
       </w:r>
     </w:p>
     <w:p>
@@ -1861,7 +2184,7 @@
           <w:b w:val="0"/>
           <w:i w:val="0"/>
         </w:rPr>
-        <w:t>Push by the rank-gap step; raise the budget 30% in the same write wherever the last 7 days used 80% or more of it. On the flagship “Bamboo Sheets” both move: it spent 127% of its budget over the last 7 days, so without the budget raise a higher price only runs it out of money earlier in the day. Read budget use daily; if it still caps out, the next step is budget again.</w:t>
+        <w:t>Push by the delivery-gap step; raise the budget 30% in the same write wherever the last 7 days used 80% or more of it. On the flagship “Bamboo Sheets” both move: it spent 127% of its budget over the last 7 days, so without the budget raise a higher price only runs it out of money earlier in the day. Read budget use daily; if it still caps out, the next step is budget again.</w:t>
       </w:r>
     </w:p>
     <w:p>
@@ -1888,7 +2211,7 @@
           <w:b w:val="0"/>
           <w:i w:val="0"/>
         </w:rPr>
-        <w:t>Product pages over 20% means money landing on the placement that does not move rank. On an in-focus campaign during the deal the fix is one combined write: the base comes down (sized to the leak, never more than 25% where product pages carry orders) and the top-of-search price goes up by the rank-gap step. The base step is graded on product-page share, the price step on top-of-search clicks, so neither hides the other.</w:t>
+        <w:t>Product pages over 20% means money landing on the placement that does not move rank. On an in-focus campaign during the deal the fix is one combined write: the base comes down (sized to the leak, never more than 25% where product pages carry orders) and the top-of-search price goes up by the delivery-gap step. The base step is graded on product-page share, the price step on top-of-search clicks, so neither hides the other.</w:t>
       </w:r>
     </w:p>
     <w:p>
@@ -1926,7 +2249,7 @@
           <w:b w:val="0"/>
           <w:i w:val="0"/>
         </w:rPr>
-        <w:t xml:space="preserve"> — no rank on file. 90 days: 228 clicks — 146 top of search, 66 product pages, 16 rest of search (64% / 29% / 7%), 37 orders. Last 14 days: 16 clicks — 7 top of search, 9 product pages, 0 rest of search (44% / 56% / 0%). In the deal (09-15 → 09-22): 6 top-of-search clicks (0.8/day, against 0.3/day before it); last 3 days 5 clicks. Budget $80.00/day, last 7 days 9% used. The run writes modifier 136% → 162%, base $2.53 → $2.28. Correction: +25% (no rank read on file → +25%) — TOS $5.97 → $7.46; base −25% for product pages at 56% (d14): base $2.53 → $1.90; modifier 293%.</w:t>
+        <w:t xml:space="preserve"> — no rank on file. 90 days: 228 clicks — 146 top of search, 66 product pages, 16 rest of search (64% / 29% / 7%), 37 orders. Last 14 days: 16 clicks — 7 top of search, 9 product pages, 0 rest of search (44% / 56% / 0%). In the deal (09-15 → 09-22): 6 top-of-search clicks (0.8/day, against 0.3/day before it); last 3 days 5 clicks. Budget $80.00/day, last 7 days 9% used. The run writes modifier 136% → 162%, base $2.53 → $2.28. Correction: +20% (no click requirement on file → +20% (a stated departure: the logic document would hold at the ceiling)) — TOS $5.97 → $7.16; a top-of-search order then costs up to $44 (a loss of $16 against $27.81 contribution; stop at $13.71); impression share 4.3% → 6.5% in the deal; base −25% for product pages at 56% (d14): base $2.53 → $1.90; modifier 278%.</w:t>
       </w:r>
     </w:p>
     <w:p>
@@ -1945,7 +2268,7 @@
           <w:b w:val="0"/>
           <w:i w:val="0"/>
         </w:rPr>
-        <w:t xml:space="preserve"> — no rank on file. 90 days: 509 clicks — 53 top of search, 450 product pages, 6 rest of search (10% / 88% / 1%), 49 orders. Last 14 days: 24 clicks — 0 top of search, 23 product pages, 1 rest of search (0% / 96% / 4%). In the deal (09-15 → 09-22): 0 top-of-search clicks (0.0/day, against 0.2/day before it); last 3 days 1 clicks. Budget $26.00/day, last 7 days 5% used. The run holds it. Correction: +25% (no rank read on file → +25%) — TOS $2.66 → $3.32; base −25% for product pages at 96% (d14): base $1.43 → $1.07; modifier 210%.</w:t>
+        <w:t xml:space="preserve"> — no rank on file. 90 days: 509 clicks — 53 top of search, 450 product pages, 6 rest of search (10% / 88% / 1%), 49 orders. Last 14 days: 24 clicks — 0 top of search, 23 product pages, 1 rest of search (0% / 96% / 4%). In the deal (09-15 → 09-22): 0 top-of-search clicks (0.0/day, against 0.2/day before it); last 3 days 1 clicks. Budget $26.00/day, last 7 days 5% used. The run holds it. Correction: +10% (no click requirement on file → +20% (a stated departure: the logic document would hold at the ceiling); halved — impression share did not rise after the 15 Sep raise (4.1% → 3.7%)) — TOS $2.66 → $2.93; a top-of-search order then costs up to $31 (still a profit of $3 against $33.87 contribution; stop at $9.58); impression share 4.1% → 3.7% in the deal; base −25% for product pages at 96% (d14): base $1.43 → $1.07; modifier 173%.</w:t>
       </w:r>
     </w:p>
     <w:p>
@@ -1972,7 +2295,7 @@
         <w:pStyle w:val="Heading1"/>
       </w:pPr>
       <w:r>
-        <w:t>A5. 3 in-focus campaigns that went dark or faded — restore, then push</w:t>
+        <w:t>A5. 2 in-focus campaigns that went dark or faded — restore, then push</w:t>
       </w:r>
     </w:p>
     <w:p>
@@ -2010,7 +2333,7 @@
           <w:b w:val="0"/>
           <w:i w:val="0"/>
         </w:rPr>
-        <w:t>Raised the top-of-search price on 1, cut it on 0, held 0.</w:t>
+        <w:t>Raised the top-of-search price on 0, cut it on 0, held 0.</w:t>
       </w:r>
     </w:p>
     <w:p>
@@ -2029,7 +2352,7 @@
           <w:b w:val="0"/>
           <w:i w:val="0"/>
         </w:rPr>
-        <w:t xml:space="preserve"> — rank 30 → 20 in thirty days, target 10. 90 days: 905 clicks — 211 top of search, 671 product pages, 23 rest of search (23% / 74% / 3%), 110 orders. Last 14 days: 16 clicks — 7 top of search, 8 product pages, 1 rest of search (44% / 50% / 6%). In the deal (09-15 → 09-22): 5 top-of-search clicks (0.6/day, against 1.3/day before it); last 3 days 4 clicks. Plan needs 351 paid clicks a week (50.1/day). Top-of-search impression share 0.98%. Budget $60.00/day, last 7 days 8% used. Top of search converts 17.5% against a market 3.56%. The run writes modifier 210% → 296%, base $1.60 → $1.25 — top-of-search price $4.96 → $4.95. Correction: +20% (rank 20 vs target 10: up to 2× the target → +20%) — TOS $4.96 → $5.95; base −25% for product pages at 50% (d14): base $1.60 → $1.20; modifier 396% Restore first: on 10 September it was cut (TOS modifier 210→310; bamboo sheets king size 1.6→1.21; sheets king size bed set bamboo 2.48→1.88).</w:t>
+        <w:t xml:space="preserve"> — rank 21 → 21 in thirty days, target 10. 90 days: 905 clicks — 211 top of search, 671 product pages, 23 rest of search (23% / 74% / 3%), 110 orders. Last 14 days: 16 clicks — 7 top of search, 8 product pages, 1 rest of search (44% / 50% / 6%). In the deal (09-15 → 09-22): 5 top-of-search clicks (0.6/day, against 1.3/day before it); last 3 days 4 clicks. Plan needs 351 paid clicks a week (50.1/day). Top-of-search impression share 0.98%. Budget $60.00/day, last 7 days 8% used. Top of search converts 17.5% against a market 3.56%. The run writes modifier 210% → 296%, base $1.60 → $1.25 — top-of-search price $4.96 → $4.95. Correction: +30% (1% of required top-of-search clicks delivered → +30%) — TOS $4.96 → $6.45; a top-of-search order then costs up to $37 (a loss of $11 against $25.54 contribution; stop at $13.44); impression share 0.6% → 0.3% in the deal; base −25% for product pages at 50% (d14): base $1.60 → $1.20; modifier 437% Already restored: the 10 September round (TOS modifier 210→310; bamboo sheets king size 1.6→1.21; sheets king size bed set bamboo 2.48→1.88) was put back on 15 September, so there is nothing to restore — go straight to the push.</w:t>
       </w:r>
     </w:p>
     <w:p>
@@ -2048,7 +2371,7 @@
           <w:b w:val="0"/>
           <w:i w:val="0"/>
         </w:rPr>
-        <w:t xml:space="preserve"> — rank 20, target 6. 90 days: 105 clicks — 72 top of search, 18 product pages, 15 rest of search (69% / 17% / 14%), 18 orders. Last 14 days: 1 clicks — 0 top of search, 1 product pages, 0 rest of search (0% / 100% / 0%). In the deal (09-15 → 09-22): 0 top-of-search clicks (0.0/day, against 0.2/day before it); last 3 days 0 clicks. Plan needs 36 paid clicks a week (5.1/day). Top-of-search impression share 5.64%. Budget $5.00/day, last 7 days 4% used. Top of search converts 19.4% against a market 4.81%. The run writes budget $5.00 → $9.64. Correction: +30% (rank 20 vs target 6: more than 2× the target → +30%) — TOS $2.85 → $3.70; modifier 95%.</w:t>
+        <w:t xml:space="preserve"> — rank 20, target 6. 90 days: 105 clicks — 72 top of search, 18 product pages, 15 rest of search (69% / 17% / 14%), 18 orders. Last 14 days: 1 clicks — 0 top of search, 1 product pages, 0 rest of search (0% / 100% / 0%). In the deal (09-15 → 09-22): 0 top-of-search clicks (0.0/day, against 0.2/day before it); last 3 days 0 clicks. Plan needs 36 paid clicks a week (5.1/day). Top-of-search impression share 5.64%. Budget $5.00/day, last 7 days 4% used. Top of search converts 19.4% against a market 4.81%. The run writes budget $5.00 → $9.64. Correction: +30% (0% of required top-of-search clicks delivered → +30%) — TOS $2.85 → $3.70; a top-of-search order then costs up to $19 (still a profit of $8 against $27.09 contribution; stop at $15.80); impression share 1.6% → 0.0% in the deal; modifier 95%.</w:t>
       </w:r>
     </w:p>
     <w:p>
@@ -2067,7 +2390,7 @@
           <w:b w:val="0"/>
           <w:i w:val="0"/>
         </w:rPr>
-        <w:t>Restore the pre-cut values (or, where they were already restored on 15 September and it still isn’t serving, go straight to the push) and check the ad, child and eligibility the same day.</w:t>
+        <w:t>Restore the values it last served at where they have not been put back; where the 15 September round already restored them and it still isn’t serving, go straight to the push and check the ad, child and eligibility the same day.</w:t>
       </w:r>
     </w:p>
     <w:p>
@@ -2075,7 +2398,7 @@
         <w:pStyle w:val="Heading1"/>
       </w:pPr>
       <w:r>
-        <w:t>A6. 4 in-focus campaigns whose keyword lost more than 10 positions — push and investigate the same day</w:t>
+        <w:t>A6. 5 in-focus campaigns whose keyword lost more than 10 positions — push and investigate the same day</w:t>
       </w:r>
     </w:p>
     <w:p>
@@ -2113,26 +2436,7 @@
           <w:b w:val="0"/>
           <w:i w:val="0"/>
         </w:rPr>
-        <w:t>Raised the top-of-search price on 1, cut it on 0, held 2.</w:t>
-      </w:r>
-    </w:p>
-    <w:p>
-      <w:pPr>
-        <w:spacing w:after="100"/>
-        <w:ind w:left="227"/>
-      </w:pPr>
-      <w:r>
-        <w:rPr>
-          <w:b/>
-        </w:rPr>
-        <w:t>King Size Bamboo Sheet Sets-(VLSV)-Exact-(Ranking)-DO-BAMBOO-KING-WHITE</w:t>
-      </w:r>
-      <w:r>
-        <w:rPr>
-          <w:b w:val="0"/>
-          <w:i w:val="0"/>
-        </w:rPr>
-        <w:t xml:space="preserve"> — rank 22 → 40 in thirty days, target 9. 90 days: 405 clicks — 122 top of search, 270 product pages, 13 rest of search (30% / 67% / 3%), 63 orders. Last 14 days: 30 clicks — 30 top of search, 0 product pages, 0 rest of search (100% / 0% / 0%). In the deal (09-15 → 09-22): 30 top-of-search clicks (3.8/day, against 0.2/day before it); last 3 days 10 clicks. Plan needs 23 paid clicks a week (3.3/day). Top-of-search impression share 5.91%. Budget $32.00/day, last 7 days 101% used. The run writes modifier 502% → 568%, base $1.55 → $1.40 — top-of-search price $9.33 → $9.35. Correction: +30% (rank 40 vs target 9: more than 2× the target → +30%) — TOS $9.33 → $12.13; modifier 683%; budget $32.00 → $41.60.</w:t>
+        <w:t>Raised the top-of-search price on 2, cut it on 0, held 2.</w:t>
       </w:r>
     </w:p>
     <w:p>
@@ -2151,7 +2455,7 @@
           <w:b w:val="0"/>
           <w:i w:val="0"/>
         </w:rPr>
-        <w:t xml:space="preserve"> — rank 48 → 62 in thirty days, target 6. 90 days: 1356 clicks — 322 top of search, 930 product pages, 104 rest of search (24% / 69% / 8%), 178 orders. Last 14 days: 101 clicks — 2 top of search, 97 product pages, 2 rest of search (2% / 96% / 2%). In the deal (09-15 → 09-22): 0 top-of-search clicks (0.0/day, against 0.1/day before it); last 3 days 17 clicks. Plan needs 87 paid clicks a week (12.4/day). Budget $78.00/day, last 7 days 15% used. The run holds it. Correction: +30% (rank 62 vs target 6: more than 2× the target → +30%) — TOS $3.75 → $4.88; base −25% for product pages at 96% (d14): base $2.26 → $1.69; modifier 188%.</w:t>
+        <w:t xml:space="preserve"> — rank 54 → 71 in thirty days, target 6. 90 days: 1356 clicks — 322 top of search, 930 product pages, 104 rest of search (24% / 69% / 8%), 178 orders. Last 14 days: 101 clicks — 2 top of search, 97 product pages, 2 rest of search (2% / 96% / 2%). In the deal (09-15 → 09-22): 0 top-of-search clicks (0.0/day, against 0.1/day before it); last 3 days 17 clicks. Plan needs 87 paid clicks a week (12.4/day). Budget $78.00/day, last 7 days 15% used. The run holds it. Correction: +15% (0% of required top-of-search clicks delivered → +30%; halved — impression share did not rise after the 15 Sep raise (0.0% → 0.0%)) — TOS $3.75 → $4.31; a top-of-search order then costs up to $28 (a loss of $1 against $27.09 contribution; stop at $12.37); impression share 0.0% → 0.0% in the deal; base −25% for product pages at 96% (d14): base $2.26 → $1.69; modifier 155%.</w:t>
       </w:r>
     </w:p>
     <w:p>
@@ -2170,7 +2474,7 @@
           <w:b w:val="0"/>
           <w:i w:val="0"/>
         </w:rPr>
-        <w:t xml:space="preserve"> — rank 30 → 42 in thirty days, target 7. 90 days: no clicks, 0 orders. Last 14 days: no clicks. In the deal (09-15 → 09-22): 0 top-of-search clicks (0.0/day, against 0.0/day before it); last 3 days 0 clicks. Plan needs 34 paid clicks a week (4.9/day). Budget $39.00/day, last 7 days 0% used. The run holds it. Correction: +30% (rank 42 vs target 7: more than 2× the target → +30%) — TOS $3.41 → $4.43; modifier 235%.</w:t>
+        <w:t xml:space="preserve"> — rank 27 → 42 in thirty days, target 7. 90 days: no clicks, 0 orders. Last 14 days: no clicks. In the deal (09-15 → 09-22): 0 top-of-search clicks (0.0/day, against 0.0/day before it); last 3 days 0 clicks. Plan needs 34 paid clicks a week (4.9/day). Budget $39.00/day, last 7 days 0% used. The run holds it. Correction: +30% (0% of required top-of-search clicks delivered → +30%) — TOS $3.41 → $4.43; a top-of-search order then costs up to $29 (a loss of $1 against $27.09 contribution; stop at $12.63); modifier 235%.</w:t>
       </w:r>
     </w:p>
     <w:p>
@@ -2189,7 +2493,7 @@
           <w:b w:val="0"/>
           <w:i w:val="0"/>
         </w:rPr>
-        <w:t>Push by the rank-gap step and, the same day: check the listing and its badge, which child the ad serves and its stock, the rival now ahead and whether it is on a deal, and the term’s search volume. If the push buys clicks and rank keeps falling, the cause is not price — stop stepping and fix it.</w:t>
+        <w:t>Push by the delivery-gap step and, the same day: check the listing and its badge, which child the ad serves and its stock, the rival now ahead and whether it is on a deal, and the term’s search volume. If the push buys clicks and rank keeps falling, the cause is not price — stop stepping and fix it.</w:t>
       </w:r>
     </w:p>
     <w:p>
@@ -2197,53 +2501,7 @@
         <w:pStyle w:val="Heading1"/>
       </w:pPr>
       <w:r>
-        <w:t>A7. 1 in-focus campaign already delivering its clicks — the one exception</w:t>
-      </w:r>
-    </w:p>
-    <w:p>
-      <w:pPr>
-        <w:spacing w:after="100"/>
-      </w:pPr>
-      <w:r>
-        <w:rPr>
-          <w:b/>
-          <w:color w:val="1F3A5F"/>
-        </w:rPr>
-        <w:t xml:space="preserve">The rule. </w:t>
-      </w:r>
-      <w:r>
-        <w:rPr>
-          <w:b w:val="0"/>
-          <w:i w:val="0"/>
-        </w:rPr>
-        <w:t>A campaign already delivering its required top-of-search clicks is not pushed further. If it is at its rank target and converting poorly, that is the one case to evaluate lowering cost per click; after the deal, probe the price down 3–5% and watch click share.</w:t>
-      </w:r>
-    </w:p>
-    <w:p>
-      <w:pPr>
-        <w:spacing w:after="100"/>
-        <w:ind w:left="227"/>
-      </w:pPr>
-      <w:r>
-        <w:rPr>
-          <w:b/>
-        </w:rPr>
-        <w:t>King Cooling Sheets-[Cooling|King]-(MSV)-Exact-(Ranking)-DO-BAMBOO-KING-WHITE</w:t>
-      </w:r>
-      <w:r>
-        <w:rPr>
-          <w:b w:val="0"/>
-          <w:i w:val="0"/>
-        </w:rPr>
-        <w:t xml:space="preserve"> — rank 33, target 12. 90 days: 252 clicks — 180 top of search, 41 product pages, 31 rest of search (71% / 16% / 12%), 38 orders. Last 14 days: 21 clicks — 21 top of search, 0 product pages, 0 rest of search (100% / 0% / 0%). In the deal (09-15 → 09-22): 17 top-of-search clicks (2.1/day, against 0.9/day before it); last 3 days 5 clicks. Plan needs 19 paid clicks a week (2.7/day). Top-of-search impression share 4.35%. Budget $13.00/day, last 7 days 106% used. The run writes budget $13.00 → $16.90. Correction: hold the price; keep the budget raise (it used 106% of its budget in the last 7 days); after 09-28, evaluate cost per click.</w:t>
-      </w:r>
-    </w:p>
-    <w:p>
-      <w:pPr>
-        <w:pStyle w:val="Heading1"/>
-      </w:pPr>
-      <w:r>
-        <w:t>A8. 1 in-focus campaign whose only keyword is paused — not a push</w:t>
+        <w:t>A7. 1 in-focus campaign whose only keyword is paused — not a push</w:t>
       </w:r>
     </w:p>
     <w:p>
@@ -2281,7 +2539,7 @@
           <w:b w:val="0"/>
           <w:i w:val="0"/>
         </w:rPr>
-        <w:t xml:space="preserve"> — rank 45 → 24 in thirty days, target 10. 90 days: 145 clicks — 64 top of search, 73 product pages, 8 rest of search (44% / 50% / 6%), 25 orders. Last 14 days: no clicks. In the deal (09-15 → 09-22): 0 top-of-search clicks (0.0/day, against 0.5/day before it); last 3 days 0 clicks. Plan needs 1285 paid clicks a week (183.6/day). Top-of-search impression share 0.36%. Budget $10.00/day, last 7 days 0% used. The run writes modifier 39% → 47%. Its keyword is paused, and the same exact term runs in the flagship “Bamboo Sheets” campaign, which carries the push. Correction: leave it paused; take it out of the push list and the “went dark” list.</w:t>
+        <w:t xml:space="preserve"> — rank 29 → 33 in thirty days, target 10. 90 days: 145 clicks — 64 top of search, 73 product pages, 8 rest of search (44% / 50% / 6%), 25 orders. Last 14 days: no clicks. In the deal (09-15 → 09-22): 0 top-of-search clicks (0.0/day, against 0.5/day before it); last 3 days 0 clicks. Plan needs 1285 paid clicks a week (183.6/day). Top-of-search impression share 0.36%. Budget $10.00/day, last 7 days 0% used. The run writes modifier 39% → 47%. Its keyword is paused, and the same exact term runs in the flagship “Bamboo Sheets” campaign, which carries the push. Correction: leave it paused; take it out of the push list and the “went dark” list.</w:t>
       </w:r>
     </w:p>
     <w:p>
@@ -2289,7 +2547,7 @@
         <w:pStyle w:val="Heading1"/>
       </w:pPr>
       <w:r>
-        <w:t>A9. 7 in-focus campaigns advertising a hero that can’t ship — re-point the ad the same day</w:t>
+        <w:t>A8. 7 in-focus campaigns advertising a hero that can’t ship — re-point the ad the same day</w:t>
       </w:r>
     </w:p>
     <w:p>
@@ -2314,6 +2572,25 @@
     <w:p>
       <w:pPr>
         <w:spacing w:after="100"/>
+      </w:pPr>
+      <w:r>
+        <w:rPr>
+          <w:b/>
+          <w:color w:val="1F3A5F"/>
+        </w:rPr>
+        <w:t xml:space="preserve">Check first. </w:t>
+      </w:r>
+      <w:r>
+        <w:rPr>
+          <w:b w:val="0"/>
+          <w:i w:val="0"/>
+        </w:rPr>
+        <w:t>Which child the rank tracker reads for each term. If “bamboo sheets queen size” is tracked on the white child and the ad moves to the olive child, the push buys sales the tracker does not watch and the read shows a miss that is not one — confirm the tracked child before the write, and grade on the child the sales land on.</w:t>
+      </w:r>
+    </w:p>
+    <w:p>
+      <w:pPr>
+        <w:spacing w:after="100"/>
         <w:ind w:left="227"/>
       </w:pPr>
       <w:r>
@@ -2327,7 +2604,7 @@
           <w:b w:val="0"/>
           <w:i w:val="0"/>
         </w:rPr>
-        <w:t xml:space="preserve"> — rank 40 → 49 in thirty days, target 6. 90 days: 313 clicks — 138 top of search, 169 product pages, 6 rest of search (44% / 54% / 2%), 51 orders. Last 14 days: 62 clicks — 51 top of search, 11 product pages, 0 rest of search (82% / 18% / 0%). In the deal (09-15 → 09-22): 32 top-of-search clicks (4.0/day, against 2.7/day before it); last 3 days 15 clicks. Plan needs 247 paid clicks a week (35.3/day). Top-of-search impression share 1.17%. Budget $49.72/day, last 7 days 102% used. Top of search converts 23.2% against a market 4.21%. The run writes modifier 258% → 358%, base $1.87 → $1.77 — top-of-search price $6.69 → $8.11. It advertises BAMBOO-QUEEN-WHITE (room: UNDER_HORIZON); the serving child is BAMBOO-QUEEN-OLIVE with 339 available. Correction: re-point the ad to the serving child in the same write as the push.</w:t>
+        <w:t xml:space="preserve"> — rank 37 → 46 in thirty days, target 6. 90 days: 313 clicks — 138 top of search, 169 product pages, 6 rest of search (44% / 54% / 2%), 51 orders. Last 14 days: 62 clicks — 51 top of search, 11 product pages, 0 rest of search (82% / 18% / 0%). In the deal (09-15 → 09-22): 32 top-of-search clicks (4.0/day, against 2.7/day before it); last 3 days 15 clicks. Plan needs 247 paid clicks a week (35.3/day). Top-of-search impression share 1.17%. Budget $49.72/day, last 7 days 102% used. Top of search converts 23.2% against a market 4.21%. The run writes modifier 258% → 358%, base $1.87 → $1.77 — top-of-search price $6.69 → $8.11. It advertises BAMBOO-QUEEN-WHITE (room: UNDER_HORIZON); the serving child is BAMBOO-QUEEN-OLIVE with 339 available. Correction: re-point the ad to the serving child in the same write as the push.</w:t>
       </w:r>
     </w:p>
     <w:p>
@@ -2381,7 +2658,7 @@
         <w:pStyle w:val="Heading1"/>
       </w:pPr>
       <w:r>
-        <w:t>B1. 103 out-of-focus campaigns under 15 clicks — hold them flat</w:t>
+        <w:t>B1. 102 out-of-focus campaigns under 15 clicks — hold them flat</w:t>
       </w:r>
     </w:p>
     <w:p>
@@ -2419,7 +2696,7 @@
           <w:b w:val="0"/>
           <w:i w:val="0"/>
         </w:rPr>
-        <w:t>Held 96; moved 7 — raised the price on 3, cut it on 1.</w:t>
+        <w:t>Held 95; moved 7 — raised the price on 3, cut it on 1.</w:t>
       </w:r>
     </w:p>
     <w:p>
@@ -2560,7 +2837,7 @@
           <w:b w:val="0"/>
           <w:i w:val="0"/>
         </w:rPr>
-        <w:t xml:space="preserve"> — rank 66, target 21. 90 days: 1184 clicks — 522 top of search, 461 product pages, 201 rest of search (44% / 39% / 17%), 124 orders. Last 14 days: 108 clicks — 40 top of search, 54 product pages, 14 rest of search (37% / 50% / 13%). In the deal (09-15 → 09-22): 17 top-of-search clicks (2.1/day, against 3.9/day before it); last 3 days 8 clicks. Plan needs 15 paid clicks a week (2.1/day). Top-of-search impression share 1.3%. Budget $76.05/day, last 7 days 15% used. Top of search converts 12.6% against a market 1.65%. The run writes base $1.44 → $1.60. Correction: base −35% → $1.27, modifier 185% so top of search stays at $3.61.</w:t>
+        <w:t xml:space="preserve"> — rank 101 → 72 in thirty days, target 21. 90 days: 1184 clicks — 522 top of search, 461 product pages, 201 rest of search (44% / 39% / 17%), 124 orders. Last 14 days: 108 clicks — 40 top of search, 54 product pages, 14 rest of search (37% / 50% / 13%). In the deal (09-15 → 09-22): 17 top-of-search clicks (2.1/day, against 3.9/day before it); last 3 days 8 clicks. Plan needs 15 paid clicks a week (2.1/day). Top-of-search impression share 1.3%. Budget $76.05/day, last 7 days 15% used. Top of search converts 12.6% against a market 1.65%. The run writes base $1.44 → $1.60. Correction: base −35% → $1.27, modifier 185% so top of search stays at $3.61.</w:t>
       </w:r>
     </w:p>
     <w:p>
@@ -2587,7 +2864,7 @@
         <w:pStyle w:val="Heading1"/>
       </w:pPr>
       <w:r>
-        <w:t>B3. 3 out-of-focus campaigns with a readable record — hold what works</w:t>
+        <w:t>B3. 2 out-of-focus campaigns with a readable record — hold what works</w:t>
       </w:r>
     </w:p>
     <w:p>
@@ -2625,7 +2902,7 @@
           <w:b w:val="0"/>
           <w:i w:val="0"/>
         </w:rPr>
-        <w:t xml:space="preserve"> — rank 28, target 5. 90 days: 410 clicks — 95 top of search, 307 product pages, 8 rest of search (23% / 75% / 2%), 42 orders. Last 14 days: 39 clicks — 39 top of search, 0 product pages, 0 rest of search (100% / 0% / 0%). In the deal (09-15 → 09-22): 39 top-of-search clicks (4.9/day, against 0.7/day before it); last 3 days 14 clicks. Plan needs 148 paid clicks a week (21.1/day). Top-of-search impression share 1.64%. Budget $31.00/day, last 7 days 129% used. Top of search converts 13.7% against a market 1.82%. The run writes modifier 718% → 818%, base $0.93 → $0.83 — top-of-search price $7.61 → $7.62. Correction: hold flat — no cut, no raise.</w:t>
+        <w:t xml:space="preserve"> — rank 45 → 28 in thirty days, target 5. 90 days: 410 clicks — 95 top of search, 307 product pages, 8 rest of search (23% / 75% / 2%), 42 orders. Last 14 days: 39 clicks — 39 top of search, 0 product pages, 0 rest of search (100% / 0% / 0%). In the deal (09-15 → 09-22): 39 top-of-search clicks (4.9/day, against 0.7/day before it); last 3 days 14 clicks. Plan needs 148 paid clicks a week (21.1/day). Top-of-search impression share 1.64%. Budget $31.00/day, last 7 days 129% used. Top of search converts 13.7% against a market 1.82%. The run writes modifier 718% → 818%, base $0.93 → $0.83 — top-of-search price $7.61 → $7.62. Correction: hold flat — no cut, no raise.</w:t>
       </w:r>
     </w:p>
     <w:p>
@@ -2645,25 +2922,6 @@
           <w:i w:val="0"/>
         </w:rPr>
         <w:t xml:space="preserve"> — rank 46, target 5. 90 days: 44 clicks — 37 top of search, 6 product pages, 1 rest of search (84% / 14% / 2%), 7 orders. Last 14 days: 37 clicks — 34 top of search, 2 product pages, 1 rest of search (92% / 5% / 3%). In the deal (09-15 → 09-22): 24 top-of-search clicks (3.0/day, against 0.6/day before it); last 3 days 9 clicks. Plan needs 17 paid clicks a week (2.4/day). Top-of-search impression share 1.74%. Budget $18.38/day, last 7 days 119% used. Top of search converts 19.0% against a market 4.69%. The run writes budget $18.38 → $23.89. Correction: hold flat — no cut, no raise.</w:t>
-      </w:r>
-    </w:p>
-    <w:p>
-      <w:pPr>
-        <w:spacing w:after="100"/>
-        <w:ind w:left="227"/>
-      </w:pPr>
-      <w:r>
-        <w:rPr>
-          <w:b/>
-        </w:rPr>
-        <w:t>Bamboo Sheets Full Size-[Bamboo|Full]-(MSV)-Exact-(Ranking)-DO-BAMBOO-FULL-OLIVE</w:t>
-      </w:r>
-      <w:r>
-        <w:rPr>
-          <w:b w:val="0"/>
-          <w:i w:val="0"/>
-        </w:rPr>
-        <w:t xml:space="preserve"> — rank 44, target 10. 90 days: 188 clicks — 113 top of search, 63 product pages, 12 rest of search (60% / 34% / 6%), 43 orders. Last 14 days: 43 clicks — 34 top of search, 8 product pages, 1 rest of search (79% / 19% / 2%). In the deal (09-15 → 09-22): 27 top-of-search clicks (3.4/day, against 0.7/day before it); last 3 days 13 clicks. Plan needs 20 paid clicks a week (2.9/day). Top-of-search impression share 3.11%. Budget $25.00/day, last 7 days 81% used. Top of search converts 21.2% against a market 3.91%. The run writes modifier 351% → 451%, base $1.10 → $0.99 — top-of-search price $4.96 → $5.45. Correction: hold flat — no cut, no raise.</w:t>
       </w:r>
     </w:p>
     <w:p>
@@ -2709,7 +2967,7 @@
           <w:b w:val="0"/>
           <w:i w:val="0"/>
         </w:rPr>
-        <w:t xml:space="preserve"> — no rank on file. 90 days: 1150 clicks — 444 top of search, 557 product pages, 149 rest of search (39% / 48% / 13%), 148 orders. Last 14 days: 8 clicks — 0 top of search, 7 product pages, 1 rest of search (0% / 88% / 12%). In the deal (09-15 → 09-22): 0 top-of-search clicks (0.0/day, against 0.4/day before it); last 3 days 1 clicks. Budget $79.00/day, last 7 days 1% used. The run holds it. Correction: restore the values before the 15 September changes and read the next day.</w:t>
+        <w:t xml:space="preserve"> — rank 72 → 59 in thirty days, target 10. 90 days: 1150 clicks — 444 top of search, 557 product pages, 149 rest of search (39% / 48% / 13%), 148 orders. Last 14 days: 8 clicks — 0 top of search, 7 product pages, 1 rest of search (0% / 88% / 12%). In the deal (09-15 → 09-22): 0 top-of-search clicks (0.0/day, against 0.4/day before it); last 3 days 1 clicks. Budget $79.00/day, last 7 days 1% used. The run holds it. Correction: restore the values before the 15 September changes and read the next day.</w:t>
       </w:r>
     </w:p>
     <w:p>
@@ -2755,7 +3013,7 @@
         <w:pStyle w:val="Heading1"/>
       </w:pPr>
       <w:r>
-        <w:t>B5. 10 out-of-focus campaigns whose keyword lost more than 10 positions — investigate</w:t>
+        <w:t>B5. 12 out-of-focus campaigns whose keyword lost more than 10 positions — investigate</w:t>
       </w:r>
     </w:p>
     <w:p>
@@ -2850,7 +3108,7 @@
           <w:b w:val="0"/>
           <w:i w:val="0"/>
         </w:rPr>
-        <w:t>Freeze all 10; name the cause on each before any price moves again.</w:t>
+        <w:t>Freeze all 12; name the cause on each before any price moves again.</w:t>
       </w:r>
     </w:p>
     <w:p>
@@ -4366,7 +4624,7 @@
           <w:b w:val="0"/>
           <w:i w:val="0"/>
         </w:rPr>
-        <w:t xml:space="preserve"> sized by the rank gap (+10% within 5 positions, +20% up to twice the target, +30% beyond, +25% with no rank read); no hold for being thin, having no clicks or being “under review”; no price cap until the required top-of-search clicks arrive, then evaluate cost per click. Out-of-focus thin rows: hold. Out-of-focus rows with a record: judge on their own numbers.</w:t>
+        <w:t xml:space="preserve"> sized by the delivery gap (+30% under 30% delivered, +20% at 30–70%, +10% over 70%), halved where the last raise bought no impression share; no hold for being thin or under review. Replace the circular market bound (our own paid CPC + 15%) with money bounds: a loss stop per row (cost per top-of-search order ≤ 3× contribution), a spend envelope for the push, a share stop (≥40% and flat), and a reachability check (requirement vs delivered ÷ share). After the deal, rows short of requirement step down to break-even; they do not keep climbing. Out-of-focus thin rows: hold. Out-of-focus rows with a record: judge on their own numbers.</w:t>
       </w:r>
     </w:p>
     <w:p>
@@ -4507,6 +4765,26 @@
           <w:i w:val="0"/>
         </w:rPr>
         <w:t xml:space="preserve"> — the book’s rate for the step size, on the window it runs in — not the plan’s requirement. The account’s hit rate is 4.8%.</w:t>
+      </w:r>
+    </w:p>
+    <w:p>
+      <w:pPr>
+        <w:pStyle w:val="ListBullet"/>
+        <w:spacing w:after="40"/>
+      </w:pPr>
+      <w:r>
+        <w:rPr>
+          <w:b/>
+          <w:i w:val="0"/>
+        </w:rPr>
+        <w:t>One rank source, smoothed:</w:t>
+      </w:r>
+      <w:r>
+        <w:rPr>
+          <w:b w:val="0"/>
+          <w:i w:val="0"/>
+        </w:rPr>
+        <w:t xml:space="preserve"> the tracker’s 7-day median for sizing and grading — the engine and Part D disagreed on the head term only because they read different single days.</w:t>
       </w:r>
     </w:p>
     <w:p>
@@ -4788,7 +5066,7 @@
           <w:b w:val="0"/>
           <w:i w:val="0"/>
         </w:rPr>
-        <w:t xml:space="preserve"> B4 at top of search: “bamboo sheets” CTR 3.4% vs a 1.9% bar, CVR 12.7% vs 8.3%; “queen size” 3.2% / 27% vs 1.8% / 13%; “king size” 6.7% / 16.5% vs 1.9% / 10.8%. A performance problem would show as sub-bar CTR or CVR on a decent sample; it doesn’t.</w:t>
+        <w:t xml:space="preserve"> B4 at top of search: “bamboo sheets” CTR 3.4% vs a 1.9% bar, CVR 12.7% vs 8.3%; “queen size” 3.2% / 27% vs 1.8% / 13%; “king size” 6.7% / 16.5% vs 1.9% / 10.8%. A performance problem would show as sub-bar CTR or CVR on a decent sample; it doesn’t. One caution: across the whole product, CVR fell from 11.9% to 10.0% in the deal while CPC rose to $3.39 and ACoS reached 46.7% against a 33.9% break-even (7-day attribution understates the latest days). The deal is the velocity condition the push rests on, so product-level CVR is read daily with it.</w:t>
       </w:r>
     </w:p>
     <w:p>
@@ -4808,7 +5086,7 @@
           <w:b w:val="0"/>
           <w:i w:val="0"/>
         </w:rPr>
-        <w:t xml:space="preserve"> “cooling sheets” (CVR 7.1% vs an 8.7% bar, ACoS 78%, rank flat at 55) — the broad cooling head term, where a bamboo sheet is not the category’s natural answer and Bedsure sells at $59.99 with 64,900 reviews. More bid there buys more of the same shortfall. The size-qualified cooling terms (“cooling sheets queen”, “king cooling sheets”) meet the bars and are traffic gaps.</w:t>
+        <w:t xml:space="preserve"> “cooling sheets” (CVR 7.1% vs an 8.7% bar, ACoS 78%, rank 55 → 64 on the 7-day median) — the broad cooling head term, where a bamboo sheet is not the category’s natural answer and Bedsure sells at $59.99 with 64,900 reviews. More bid there buys more of the same shortfall. The size-qualified cooling terms (“cooling sheets queen”, “king cooling sheets”) meet the bars and are traffic gaps.</w:t>
       </w:r>
     </w:p>
     <w:p>
@@ -4828,7 +5106,7 @@
           <w:b w:val="0"/>
           <w:i w:val="0"/>
         </w:rPr>
-        <w:t xml:space="preserve"> From July to the week before the deal the rounds took B4’s ad clicks from 401 to 235 a day and orders from 46 to 28. They improved the placement mix — mostly by cutting product pages — but top-of-search clicks fell too (97 → 84 a day). Rank follows the volume of converting clicks: Bamboo drifted 31 → 35, Bamboo|Queen 32 → 42. The deal round is the first that bought volume, and the one group given real top-of-search volume (Bamboo|King) moved 35 → 22.</w:t>
+        <w:t xml:space="preserve"> From July to the week before the deal the rounds took B4’s ad clicks from 401 to 235 a day and orders from 46 to 28. They improved the placement mix — mostly by cutting product pages — but top-of-search clicks fell too (97 → 84 a day). Rank follows the volume of converting clicks: Bamboo drifted 31 → 35, Bamboo|Queen 32 → 44 (7-day medians). The deal round is the first that bought volume, and the one group given real top-of-search volume (Bamboo|King) moved 31 → 26 (daily low 22).</w:t>
       </w:r>
     </w:p>
     <w:p>
@@ -4841,14 +5119,14 @@
           <w:b/>
           <w:i w:val="0"/>
         </w:rPr>
-        <w:t>Our own 6-piece listing sits in the same auctions.</w:t>
+        <w:t>A minor factor: our own 6-piece bids on the same terms.</w:t>
       </w:r>
       <w:r>
         <w:rPr>
           <w:b w:val="0"/>
           <w:i w:val="0"/>
         </w:rPr>
-        <w:t xml:space="preserve"> 1,242 of B4’s search terms (81% of its keyword spend) are also bought by the 6-piece. Amazon shows one ad per advertiser per auction, so the two dilute each other’s top-of-search share (D8).</w:t>
+        <w:t xml:space="preserve"> 1,242 of B4’s search terms (81% of its keyword spend) are also bought by the 6-piece. On “bamboo sheets” it took 48 top-of-search clicks in the deal against B4’s 379, so it explains a small part of the lost share at most; taking it off the top of search on B4’s ranking terms is cheap and the next-day share read settles it (D8).</w:t>
       </w:r>
     </w:p>
     <w:p>
@@ -4867,7 +5145,7 @@
           <w:b w:val="0"/>
           <w:i w:val="0"/>
         </w:rPr>
-        <w:t>Buy the traffic where it performs (most in-focus terms): step the top-of-search price by rank gap every day of the deal, lift budgets where they cap, and watch top-of-search impression share rise with it — that is the proof the price is working. Where impression share does not respond to price, the constraint is not price (budget cut-off, a sibling ASIN winning the auction, or eligibility) and the fix is there. Hold price and fix the offer only on the terms with a genuine CTR/CVR shortfall. Take the 6-piece off the top of search on the terms B4 is ranking. Details and the per-keyword call follow.</w:t>
+        <w:t>Buy the traffic where it performs (most in-focus terms): step the top-of-search price every day of the deal by the delivery gap, inside the loss stop and the envelope (Part A), lift budgets where they cap, and watch top-of-search impression share rise with it — that is the proof the price is working. Where impression share does not respond to price, the constraint is not price (budget cut-off, a sibling ASIN winning the auction, or eligibility) and the fix is there. Hold price and fix the offer only on the terms with a genuine CTR/CVR shortfall. Take the 6-piece off the top of search on the terms B4 is ranking. Details and the per-keyword call follow.</w:t>
       </w:r>
     </w:p>
     <w:p>
@@ -5936,7 +6214,7 @@
                 <w:i w:val="0"/>
                 <w:sz w:val="16"/>
               </w:rPr>
-              <w:t>33</w:t>
+              <w:t>34</w:t>
             </w:r>
           </w:p>
         </w:tc>
@@ -5968,7 +6246,7 @@
                 <w:i w:val="0"/>
                 <w:sz w:val="16"/>
               </w:rPr>
-              <w:t>38</w:t>
+              <w:t>34</w:t>
             </w:r>
           </w:p>
         </w:tc>
@@ -6054,7 +6332,7 @@
                 <w:i w:val="0"/>
                 <w:sz w:val="16"/>
               </w:rPr>
-              <w:t>67</w:t>
+              <w:t>66</w:t>
             </w:r>
           </w:p>
         </w:tc>
@@ -6071,7 +6349,7 @@
                 <w:i w:val="0"/>
                 <w:sz w:val="16"/>
               </w:rPr>
-              <w:t>65</w:t>
+              <w:t>68</w:t>
             </w:r>
           </w:p>
         </w:tc>
@@ -6088,7 +6366,7 @@
                 <w:i w:val="0"/>
                 <w:sz w:val="16"/>
               </w:rPr>
-              <w:t>58</w:t>
+              <w:t>56</w:t>
             </w:r>
           </w:p>
         </w:tc>
@@ -6187,7 +6465,7 @@
                 <w:i w:val="0"/>
                 <w:sz w:val="16"/>
               </w:rPr>
-              <w:t>30</w:t>
+              <w:t>31</w:t>
             </w:r>
           </w:p>
         </w:tc>
@@ -6203,7 +6481,7 @@
                 <w:i w:val="0"/>
                 <w:sz w:val="16"/>
               </w:rPr>
-              <w:t>28</w:t>
+              <w:t>26</w:t>
             </w:r>
           </w:p>
         </w:tc>
@@ -6289,7 +6567,7 @@
                 <w:i w:val="0"/>
                 <w:sz w:val="16"/>
               </w:rPr>
-              <w:t>43</w:t>
+              <w:t>40</w:t>
             </w:r>
           </w:p>
         </w:tc>
@@ -6306,7 +6584,7 @@
                 <w:i w:val="0"/>
                 <w:sz w:val="16"/>
               </w:rPr>
-              <w:t>42</w:t>
+              <w:t>44</w:t>
             </w:r>
           </w:p>
         </w:tc>
@@ -6323,7 +6601,7 @@
                 <w:i w:val="0"/>
                 <w:sz w:val="16"/>
               </w:rPr>
-              <w:t>45</w:t>
+              <w:t>44</w:t>
             </w:r>
           </w:p>
         </w:tc>
@@ -6438,7 +6716,7 @@
                 <w:i w:val="0"/>
                 <w:sz w:val="16"/>
               </w:rPr>
-              <w:t>72</w:t>
+              <w:t>58</w:t>
             </w:r>
           </w:p>
         </w:tc>
@@ -6524,7 +6802,7 @@
                 <w:i w:val="0"/>
                 <w:sz w:val="16"/>
               </w:rPr>
-              <w:t>31</w:t>
+              <w:t>34</w:t>
             </w:r>
           </w:p>
         </w:tc>
@@ -6558,7 +6836,7 @@
                 <w:i w:val="0"/>
                 <w:sz w:val="16"/>
               </w:rPr>
-              <w:t>31</w:t>
+              <w:t>26</w:t>
             </w:r>
           </w:p>
         </w:tc>
@@ -6641,7 +6919,7 @@
                 <w:i w:val="0"/>
                 <w:sz w:val="16"/>
               </w:rPr>
-              <w:t>60</w:t>
+              <w:t>59</w:t>
             </w:r>
           </w:p>
         </w:tc>
@@ -6657,7 +6935,7 @@
                 <w:i w:val="0"/>
                 <w:sz w:val="16"/>
               </w:rPr>
-              <w:t>67</w:t>
+              <w:t>73</w:t>
             </w:r>
           </w:p>
         </w:tc>
@@ -6673,7 +6951,7 @@
                 <w:i w:val="0"/>
                 <w:sz w:val="16"/>
               </w:rPr>
-              <w:t>56</w:t>
+              <w:t>54</w:t>
             </w:r>
           </w:p>
         </w:tc>
@@ -6759,7 +7037,7 @@
                 <w:i w:val="0"/>
                 <w:sz w:val="16"/>
               </w:rPr>
-              <w:t>33</w:t>
+              <w:t>35</w:t>
             </w:r>
           </w:p>
         </w:tc>
@@ -6776,7 +7054,7 @@
                 <w:i w:val="0"/>
                 <w:sz w:val="16"/>
               </w:rPr>
-              <w:t>61</w:t>
+              <w:t>44</w:t>
             </w:r>
           </w:p>
         </w:tc>
@@ -6793,7 +7071,7 @@
                 <w:i w:val="0"/>
                 <w:sz w:val="16"/>
               </w:rPr>
-              <w:t>45</w:t>
+              <w:t>52</w:t>
             </w:r>
           </w:p>
         </w:tc>
@@ -6876,6 +7154,22 @@
                 <w:i w:val="0"/>
                 <w:sz w:val="16"/>
               </w:rPr>
+              <w:t>49</w:t>
+            </w:r>
+          </w:p>
+        </w:tc>
+        <w:tc>
+          <w:tcPr>
+            <w:tcW w:type="dxa" w:w="1134"/>
+          </w:tcPr>
+          <w:p>
+            <w:r/>
+            <w:r>
+              <w:rPr>
+                <w:b w:val="0"/>
+                <w:i w:val="0"/>
+                <w:sz w:val="16"/>
+              </w:rPr>
               <w:t>23</w:t>
             </w:r>
           </w:p>
@@ -6892,23 +7186,7 @@
                 <w:i w:val="0"/>
                 <w:sz w:val="16"/>
               </w:rPr>
-              <w:t>21</w:t>
-            </w:r>
-          </w:p>
-        </w:tc>
-        <w:tc>
-          <w:tcPr>
-            <w:tcW w:type="dxa" w:w="1134"/>
-          </w:tcPr>
-          <w:p>
-            <w:r/>
-            <w:r>
-              <w:rPr>
-                <w:b w:val="0"/>
-                <w:i w:val="0"/>
-                <w:sz w:val="16"/>
-              </w:rPr>
-              <w:t>47</w:t>
+              <w:t>31</w:t>
             </w:r>
           </w:p>
         </w:tc>
@@ -7011,7 +7289,7 @@
                 <w:i w:val="0"/>
                 <w:sz w:val="16"/>
               </w:rPr>
-              <w:t>12</w:t>
+              <w:t>19</w:t>
             </w:r>
           </w:p>
         </w:tc>
@@ -7028,7 +7306,7 @@
                 <w:i w:val="0"/>
                 <w:sz w:val="16"/>
               </w:rPr>
-              <w:t>18</w:t>
+              <w:t>20</w:t>
             </w:r>
           </w:p>
         </w:tc>
@@ -7122,7 +7400,7 @@
           <w:b w:val="0"/>
           <w:i w:val="0"/>
         </w:rPr>
-        <w:t>Through August and early September every round took volume out: ad clicks fell from 401 a day (late June/July) to 328 and then 235, orders from 46 a day to 28. The placement mix moved the right way (top of search from 26% to 37% of all clicks), but top-of-search clicks themselves fell from 97 to 84 a day — the mix improved because product pages were cut harder than top of search grew. Rank drifted: Bamboo 31 → 35, Bamboo|Queen 32 → 42. The deal round (15/16 Sep) is the first that bought volume: the effective top-of-search bid rose from $4.30 to $5.51, top-of-search clicks from 84 to 150 a day — and the one group given real top-of-search volume moved: Bamboo|King went 35 → 22 inside the deal (28 on the 22nd). Bamboo (38) and Bamboo|Queen (45) did not, and those are the ones still at 3% and under 1–3% impression share.</w:t>
+        <w:t>Through August and early September every round took volume out: ad clicks fell from 401 a day (late June/July) to 328 and then 235, orders from 46 a day to 28. The placement mix moved the right way (top of search from 26% to 37% of all clicks), but top-of-search clicks themselves fell from 97 to 84 a day — the mix improved because product pages were cut harder than top of search grew. Rank drifted (7-day medians): Bamboo 31 → 35, Bamboo|Queen 32 → 44. The deal round (15/16 Sep) is the first that bought volume: the effective top-of-search bid rose from $4.30 to $5.51, top-of-search clicks from 84 to 150 a day — and the one group given real top-of-search volume moved: Bamboo|King went 31 → 26 on the 7-day median inside the deal (daily low 22 on the 21st). Bamboo (34) and Bamboo|Queen (44) did not, and those are the ones still at 3% and under 1–3% impression share. The deal also lowered product-level CVR (11.9% → 10.0%) and lifted ACoS to 46.7% — part of that is attribution lag, but it is watched daily because the deal is what the push rests on.</w:t>
       </w:r>
     </w:p>
     <w:p>
@@ -7605,7 +7883,7 @@
                 <w:i w:val="0"/>
                 <w:sz w:val="14"/>
               </w:rPr>
-              <w:t>31 → 33 → 35 → 38</w:t>
+              <w:t>31 → 34 → 35 → 34</w:t>
             </w:r>
           </w:p>
         </w:tc>
@@ -7759,7 +8037,7 @@
                 <w:i w:val="0"/>
                 <w:sz w:val="14"/>
               </w:rPr>
-              <w:t>81 → 67 → 65 → 58</w:t>
+              <w:t>81 → 66 → 68 → 56</w:t>
             </w:r>
           </w:p>
         </w:tc>
@@ -7906,7 +8184,7 @@
                 <w:i w:val="0"/>
                 <w:sz w:val="14"/>
               </w:rPr>
-              <w:t>34 → 29 → 30 → 28</w:t>
+              <w:t>34 → 29 → 31 → 26</w:t>
             </w:r>
           </w:p>
         </w:tc>
@@ -8060,7 +8338,7 @@
                 <w:i w:val="0"/>
                 <w:sz w:val="14"/>
               </w:rPr>
-              <w:t>32 → 43 → 42 → 45</w:t>
+              <w:t>32 → 40 → 44 → 44</w:t>
             </w:r>
           </w:p>
         </w:tc>
@@ -8361,7 +8639,7 @@
                 <w:i w:val="0"/>
                 <w:sz w:val="14"/>
               </w:rPr>
-              <w:t>111 → 91 → 79 → 72</w:t>
+              <w:t>111 → 91 → 79 → 58</w:t>
             </w:r>
           </w:p>
         </w:tc>
@@ -8508,7 +8786,7 @@
                 <w:i w:val="0"/>
                 <w:sz w:val="14"/>
               </w:rPr>
-              <w:t>36 → 31 → 36 → 31</w:t>
+              <w:t>36 → 34 → 36 → 26</w:t>
             </w:r>
           </w:p>
         </w:tc>
@@ -8662,7 +8940,7 @@
                 <w:i w:val="0"/>
                 <w:sz w:val="14"/>
               </w:rPr>
-              <w:t>71 → 60 → 67 → 56</w:t>
+              <w:t>71 → 59 → 73 → 54</w:t>
             </w:r>
           </w:p>
         </w:tc>
@@ -8809,7 +9087,7 @@
                 <w:i w:val="0"/>
                 <w:sz w:val="14"/>
               </w:rPr>
-              <w:t>22 → 33 → 61 → 45</w:t>
+              <w:t>22 → 35 → 44 → 52</w:t>
             </w:r>
           </w:p>
         </w:tc>
@@ -9264,7 +9542,7 @@
                 <w:i w:val="0"/>
                 <w:sz w:val="14"/>
               </w:rPr>
-              <w:t>11 → 23 → 21 → 47</w:t>
+              <w:t>11 → 49 → 23 → 31</w:t>
             </w:r>
           </w:p>
         </w:tc>
@@ -9411,7 +9689,7 @@
                 <w:i w:val="0"/>
                 <w:sz w:val="14"/>
               </w:rPr>
-              <w:t>28 → 14 → 12 → 18</w:t>
+              <w:t>28 → 14 → 19 → 20</w:t>
             </w:r>
           </w:p>
         </w:tc>
@@ -9866,7 +10144,7 @@
                 <w:i w:val="0"/>
                 <w:sz w:val="14"/>
               </w:rPr>
-              <w:t>69 → 80 → 138 → 94</w:t>
+              <w:t>69 → 72 → 89 → 103</w:t>
             </w:r>
           </w:p>
         </w:tc>
@@ -10013,7 +10291,7 @@
                 <w:i w:val="0"/>
                 <w:sz w:val="14"/>
               </w:rPr>
-              <w:t>94 → 70 → 51 → 50</w:t>
+              <w:t>94 → 87 → 51 → 47</w:t>
             </w:r>
           </w:p>
         </w:tc>
@@ -10167,7 +10445,7 @@
                 <w:i w:val="0"/>
                 <w:sz w:val="14"/>
               </w:rPr>
-              <w:t>53 → 46 → 40 → 47</w:t>
+              <w:t>53 → 44 → 38 → 45</w:t>
             </w:r>
           </w:p>
         </w:tc>
@@ -10595,7 +10873,7 @@
                 <w:i w:val="0"/>
                 <w:sz w:val="14"/>
               </w:rPr>
-              <w:t>33 → 32 → 41</w:t>
+              <w:t>33 → 38 → 33</w:t>
             </w:r>
           </w:p>
         </w:tc>
@@ -10766,7 +11044,7 @@
                 <w:i w:val="0"/>
                 <w:sz w:val="14"/>
               </w:rPr>
-              <w:t>25 → 36 → 47</w:t>
+              <w:t>25 → 38 → 46</w:t>
             </w:r>
           </w:p>
         </w:tc>
@@ -10929,7 +11207,7 @@
                 <w:i w:val="0"/>
                 <w:sz w:val="14"/>
               </w:rPr>
-              <w:t>35 → 28 → 25</w:t>
+              <w:t>35 → 26 → 21</w:t>
             </w:r>
           </w:p>
         </w:tc>
@@ -11100,7 +11378,7 @@
                 <w:i w:val="0"/>
                 <w:sz w:val="14"/>
               </w:rPr>
-              <w:t>28 → 25 → 31</w:t>
+              <w:t>28 → 24 → 28</w:t>
             </w:r>
           </w:p>
         </w:tc>
@@ -11263,7 +11541,7 @@
                 <w:i w:val="0"/>
                 <w:sz w:val="14"/>
               </w:rPr>
-              <w:t>55 → 55 → 56</w:t>
+              <w:t>55 → 49 → 64</w:t>
             </w:r>
           </w:p>
         </w:tc>
@@ -11434,7 +11712,7 @@
                 <w:i w:val="0"/>
                 <w:sz w:val="14"/>
               </w:rPr>
-              <w:t>29 → 58 → 71</w:t>
+              <w:t>29 → 62 → 71</w:t>
             </w:r>
           </w:p>
         </w:tc>
@@ -11597,7 +11875,7 @@
                 <w:i w:val="0"/>
                 <w:sz w:val="14"/>
               </w:rPr>
-              <w:t>21 → 30 → 28</w:t>
+              <w:t>21 → 30 → 25</w:t>
             </w:r>
           </w:p>
         </w:tc>
@@ -11768,7 +12046,7 @@
                 <w:i w:val="0"/>
                 <w:sz w:val="14"/>
               </w:rPr>
-              <w:t>24 → 23 → 43</w:t>
+              <w:t>24 → 28 → 31</w:t>
             </w:r>
           </w:p>
         </w:tc>
@@ -11931,7 +12209,7 @@
                 <w:i w:val="0"/>
                 <w:sz w:val="14"/>
               </w:rPr>
-              <w:t>30 → 36 → 38</w:t>
+              <w:t>30 → 30 → 47</w:t>
             </w:r>
           </w:p>
         </w:tc>
@@ -12102,7 +12380,7 @@
                 <w:i w:val="0"/>
                 <w:sz w:val="14"/>
               </w:rPr>
-              <w:t>120 → 120 → 45</w:t>
+              <w:t>120 → 114 → 59</w:t>
             </w:r>
           </w:p>
         </w:tc>
@@ -12265,7 +12543,7 @@
                 <w:i w:val="0"/>
                 <w:sz w:val="14"/>
               </w:rPr>
-              <w:t>31 → 27 → 37</w:t>
+              <w:t>31 → 31 → 35</w:t>
             </w:r>
           </w:p>
         </w:tc>
@@ -12436,7 +12714,7 @@
                 <w:i w:val="0"/>
                 <w:sz w:val="14"/>
               </w:rPr>
-              <w:t>39 → 32 → 39</w:t>
+              <w:t>39 → 36 → 42</w:t>
             </w:r>
           </w:p>
         </w:tc>
@@ -12599,7 +12877,7 @@
                 <w:i w:val="0"/>
                 <w:sz w:val="14"/>
               </w:rPr>
-              <w:t>34 → 27 → 23</w:t>
+              <w:t>34 → 28 → 26</w:t>
             </w:r>
           </w:p>
         </w:tc>
@@ -13161,7 +13439,7 @@
           <w:b w:val="0"/>
           <w:i w:val="0"/>
         </w:rPr>
-        <w:t xml:space="preserve"> — Traffic gap. Converts at 12.7% at the top (bar 8.3%), CTR 3.4% (bar 1.9%); 3.2% impression share at $7.42 and a budget used at 127% over the last 7 days. The deal doubled its top-of-search clicks (25 → 47 a day) and rank has not answered yet (32 → 41): 331 a week is still two-thirds of the 490 the plan needs. Raise the budget with the top-of-search step (it caps before the day ends — impression share counts the hours we are out), step the price +30% a day while impression share rises with it; this is also the term the 6-piece contests most (D8).</w:t>
+        <w:t xml:space="preserve"> — Traffic gap. Converts at 12.7% at the top (bar 8.3%), CTR 3.4% (bar 1.9%); 3.2% impression share at $7.42 and a budget used at 127% over the last 7 days. The deal doubled its top-of-search clicks (25 → 47 a day) and rank is moving slowly (7-day median 38 → 33 over the deal week): 331 a week is still two-thirds of the 490 the plan needs. Raise the budget with the step (it caps before the day ends — impression share counts the hours we are out). The delivery-gap step (+30%) takes it to $9.65: at a 12.9% top-of-search conversion a top-of-search order then costs about $75, one step short of its loss stop ($10.47 — 3× its $27.09 contribution). Past that, more share has to come from budget hours, the 6-piece stepping back, or a better conversion — not from price.</w:t>
       </w:r>
     </w:p>
     <w:p>
@@ -13181,7 +13459,7 @@
           <w:b w:val="0"/>
           <w:i w:val="0"/>
         </w:rPr>
-        <w:t xml:space="preserve"> — Traffic gap, the widest: 22 clicks a week against 248; CVR 27% at the top. Impression share 2.8% at $6.69 — and this campaign is on dynamic up-and-down bidding, which paid $11.99 a top-of-search click in the deal on a written $6.69 (A-section). Switch to fixed bids and step the price; budget is at 102%, lift it with the step.</w:t>
+        <w:t xml:space="preserve"> — Traffic gap, the widest: 22 clicks a week against 248; CVR 27% at the top. Impression share 2.8% at $6.69 — and this campaign is on dynamic up-and-down bidding, which paid $11.99 a top-of-search click in the deal on a written $6.69 (A-section). Switch to fixed bids starting near the $11.99 dynamic actually paid (not $6.69 plus a step, which would halve its bid); at its 23% top-of-search conversion that is about $52 a top-of-search order, inside the stop. Budget is at 102%, lift it with the step.</w:t>
       </w:r>
     </w:p>
     <w:p>
@@ -13201,7 +13479,7 @@
           <w:b w:val="0"/>
           <w:i w:val="0"/>
         </w:rPr>
-        <w:t xml:space="preserve"> — Traffic gap: 16 a week against 298, 0.6% impression share at $4.96 — the lowest effective bid of the three hero terms and the lowest share. Organic 15, sponsored 19. Step +30% a day; this is the cheapest volume on the list because CVR (16.5%) is well above the bar.</w:t>
+        <w:t xml:space="preserve"> — Traffic gap: 16 a week against 298, 0.6% impression share at $4.96 — the lowest effective bid of the three hero terms and the lowest share. Organic 15, sponsored 19. The step is +30% (1% of its requirement delivered) to $6.45 — about $37 a top-of-search order at its 17.5% conversion; this is the cheapest volume on the list. Its share fell in the deal (0.6% → 0.3%) with no raise, so it has not been given price yet.</w:t>
       </w:r>
     </w:p>
     <w:p>
@@ -13221,7 +13499,7 @@
           <w:b w:val="0"/>
           <w:i w:val="0"/>
         </w:rPr>
-        <w:t xml:space="preserve"> — Performance gap on CVR (7.1% vs 8.7%) with ACoS 78% and rank flat at 55; 76% of our traffic on this term is paid. Do not add bid. The Cooling group’s market limit is the lowest in the product ($3.61) because the term converts poorly for us. Fix the offer for this query first (cooling claim in the first image and title, price against Bedsure’s $59.99) and re-test on a small probe; keep “bamboo cooling sheets”, which meets both bars, as the cooling entry point.</w:t>
+        <w:t xml:space="preserve"> — Performance gap on CVR (7.1% vs 8.7%) with ACoS 78% and rank 55 → 64 on the 7-day median; 76% of our traffic on this term is paid. Do not add bid. The Cooling group’s market limit is the lowest in the product ($3.61) because the term converts poorly for us. Fix the offer for this query first (cooling claim in the first image and title, price against Bedsure’s $59.99) and re-test on a small probe; keep “bamboo cooling sheets”, which meets both bars, as the cooling entry point.</w:t>
       </w:r>
     </w:p>
     <w:p>
@@ -13241,7 +13519,7 @@
           <w:b w:val="0"/>
           <w:i w:val="0"/>
         </w:rPr>
-        <w:t xml:space="preserve"> — Not present: 3 top-of-search clicks in 30 days, impression share 0% at $3.75 — the price is below anything that wins the top. Rank fell 29 → 71. Eligibility and price: this row needs the rank-gap step from a floor near the group’s clearing price ($6.39), not +30% of $3.75.</w:t>
+        <w:t xml:space="preserve"> — Not present: 3 top-of-search clicks in 30 days, impression share 0% at $3.75 — the price is below anything that wins the top. Rank fell 29 → 71. Eligibility and price: this row needs the delivery-gap step from a floor near the group’s clearing price ($6.39), not +30% of $3.75.</w:t>
       </w:r>
     </w:p>
     <w:p>
@@ -13281,7 +13559,7 @@
           <w:b w:val="0"/>
           <w:i w:val="0"/>
         </w:rPr>
-        <w:t xml:space="preserve"> — One of the few targets above 10% impression share (15% at $9.33 effective); 3.4 top-of-search clicks a day in the deal, CVR 26% at the top. Proof that price buys share on this account: keep stepping.</w:t>
+        <w:t xml:space="preserve"> — One of the few targets above 10% impression share (15% at $9.33 effective); 3.4 top-of-search clicks a day in the deal, CVR 26% at the top — its campaign is now at its own click requirement (114%), so it takes no step and moves to cost-per-click evaluation after the deal. It is the proof on this account that price buys share (15% → 20% in the deal).</w:t>
       </w:r>
     </w:p>
     <w:p>
@@ -13361,14 +13639,14 @@
           <w:b/>
           <w:i w:val="0"/>
         </w:rPr>
-        <w:t>Our own second ASIN.</w:t>
+        <w:t>Our own second ASIN (minor).</w:t>
       </w:r>
       <w:r>
         <w:rPr>
           <w:b w:val="0"/>
           <w:i w:val="0"/>
         </w:rPr>
-        <w:t xml:space="preserve"> The 6-piece enters the same auctions on 1,242 of B4’s terms; Amazon serves one ad per advertiser per auction, so it takes share from B4. Test: when the 6-piece steps back on a term (D8), B4’s share on it should rise.</w:t>
+        <w:t xml:space="preserve"> The 6-piece bids on 1,242 of B4’s terms, but on “bamboo sheets” it took 48 top-of-search clicks in the deal against B4’s 379 — if B4 loses 95 auctions in 100, the sibling accounts for a small part at most. Whether Amazon admits two of our ASINs to the same auction is not confirmed here. Test: when the 6-piece steps back on a term (D8), B4’s share on it should rise.</w:t>
       </w:r>
     </w:p>
     <w:p>
@@ -16478,7 +16756,7 @@
           <w:b w:val="0"/>
           <w:i w:val="0"/>
         </w:rPr>
-        <w:t>1,242 of B4’s search terms are also bought by the Decolure 6-piece — $20,674 of B4’s 30-day keyword spend (81%). B4’s run prices every term as if the 6-piece were not in the auction.</w:t>
+        <w:t>1,242 of B4’s search terms are also bought by the Decolure 6-piece — $20,674 of B4’s 30-day keyword spend (81%). B4’s run prices every term as if the 6-piece were not in the auction. On the hero term it is a small presence (48 top-of-search clicks in the deal against B4’s 379), so this is a minor cause and a cheap test, not the main answer.</w:t>
       </w:r>
     </w:p>
     <w:p>
@@ -18000,7 +18278,7 @@
           <w:b w:val="0"/>
           <w:i w:val="0"/>
         </w:rPr>
-        <w:t xml:space="preserve"> push every in-focus exact ranking campaign on top of search daily by rank gap (Part A), with the budget raised where it caps. Read top-of-search impression share and clicks every morning; share rising with price = keep stepping; share flat after a price step = check budget hours out, the B6 sibling, and eligibility, in that order.</w:t>
+        <w:t xml:space="preserve"> push every in-focus exact ranking campaign on top of search daily by the delivery gap (Part A), inside the loss stop (3× contribution per top-of-search order) and the envelope, with the budget raised where it caps. Read impression share and clicks every morning; share rising with price = keep stepping; share flat after a step = halve the next step and check budget hours out, the sibling ASIN and eligibility.</w:t>
       </w:r>
     </w:p>
     <w:p>
@@ -18020,7 +18298,7 @@
           <w:b w:val="0"/>
           <w:i w:val="0"/>
         </w:rPr>
-        <w:t xml:space="preserve"> “bamboo sheets”, “bamboo sheets queen size” (fixed bids first), “bamboo sheets king size”: +30% a day, budget +30%, until top-of-search clicks reach the plan (490 / 248 / 298 a week). Rows at 0–0.1% share (“bamboo sheets queen”, “queen bamboo sheet set”) are reset to the group’s clearing price before stepping.</w:t>
+        <w:t xml:space="preserve"> “bamboo sheets” +30% to $9.65 (one step short of its $10.47 loss stop), “bamboo sheets queen size” to fixed near $11.99, “bamboo sheets king size” +30% to $6.45, budget +30% where it caps; each is graded on share and top-of-search clicks against the plan (490 / 248 / 298 a week). Rows at 0–0.1% share (“bamboo sheets queen”, “queen bamboo sheet set”) are reset to the group’s clearing price before stepping.</w:t>
       </w:r>
     </w:p>
     <w:p>
@@ -18100,7 +18378,7 @@
           <w:b w:val="0"/>
           <w:i w:val="0"/>
         </w:rPr>
-        <w:t xml:space="preserve"> evaluate cost per click only on terms now receiving their required clicks; hold the rest on the push until they do.</w:t>
+        <w:t xml:space="preserve"> terms at their requirement — evaluate cost per click, probing down 3–5% a step; terms short of it — step down to break-even over two writes four days apart, unless the 7-day rank reached the target range (then hold one week and read). No term keeps climbing after the deal.</w:t>
       </w:r>
     </w:p>
     <w:p>
@@ -18132,7 +18410,7 @@
           <w:b w:val="0"/>
           <w:i w:val="0"/>
         </w:rPr>
-        <w:t>2. Same day: switch Bamboo Sheets Queen Size to fixed bidding; re-point the in-focus campaigns advertising a hero that can’t ship.</w:t>
+        <w:t>2. Same day: switch Bamboo Sheets Queen Size to fixed bidding, starting near the ~$12 it was actually paying; confirm which child the tracker reads for the queen terms, then re-point the in-focus campaigns advertising a hero that can’t ship.</w:t>
       </w:r>
     </w:p>
     <w:p>
@@ -18144,7 +18422,7 @@
           <w:b w:val="0"/>
           <w:i w:val="0"/>
         </w:rPr>
-        <w:t>3. Write the A1 table: 87 in-focus campaigns pushed on top of search (step by rank gap), base cut on the in-focus leakers, budget +30% where 80%+ is used, pre-cut prices restored on the ones that went dark.</w:t>
+        <w:t>3. Write the push: 86 in-focus campaigns stepped on top of search by delivery gap, inside the loss stop and the $4,457 envelope; base cut on the in-focus leakers; budget +30% where 80%+ is used.</w:t>
       </w:r>
     </w:p>
     <w:p>
@@ -18156,7 +18434,7 @@
           <w:b w:val="0"/>
           <w:i w:val="0"/>
         </w:rPr>
-        <w:t>4. Every morning to 09-28: read top-of-search clicks, placement and budget use per in-focus campaign; step again where clicks are short; cut the base where clicks land on product pages; check eligibility where a campaign is still at zero after two steps.</w:t>
+        <w:t>4. Every morning to 09-28: top-of-search clicks, impression share, placement, budget use and hours out of budget per in-focus campaign; step again where clicks are short and share rose; halve the step where share was flat; stop at the loss stop, the share stop or the envelope; cut the base where clicks land on product pages; check eligibility where a campaign is still at zero after two steps.</w:t>
       </w:r>
     </w:p>
     <w:p>
@@ -18180,7 +18458,7 @@
           <w:b w:val="0"/>
           <w:i w:val="0"/>
         </w:rPr>
-        <w:t>6. Out of focus: hold the 103 thin rows and the ones that work; cut the base on the 4 leakers with top of search held; freeze the 10 collapses.</w:t>
+        <w:t>6. Out of focus: hold the 102 thin rows and the ones that work; cut the base on the 4 leakers with top of search held; freeze the 12 collapses.</w:t>
       </w:r>
     </w:p>
     <w:p>
@@ -18204,7 +18482,7 @@
           <w:b w:val="0"/>
           <w:i w:val="0"/>
         </w:rPr>
-        <w:t>8. Part D: the 6-piece’s top-of-search modifier to 0% on the terms B4 is ranking, for the deal. Switch Queen Size to fixed bids; reset “bamboo sheets queen” and “queen bamboo sheet set” to the group clearing price before stepping.</w:t>
+        <w:t>8. Part D: the 6-piece’s top-of-search modifier to 0% on the terms B4 is ranking, for the deal (a cheap test; read B4’s share the next day). Reset “bamboo sheets queen” and “queen bamboo sheet set” to the group clearing price before stepping.</w:t>
       </w:r>
     </w:p>
     <w:p>
@@ -18216,7 +18494,7 @@
           <w:b w:val="0"/>
           <w:i w:val="0"/>
         </w:rPr>
-        <w:t>9. Every morning, beside clicks: top-of-search impression share per hero target. Share rising with price — keep stepping; flat — check budget hours out, the sibling ASIN, eligibility.</w:t>
+        <w:t>9. Grade the price step and the budget raise separately: price on impression share, budget on hours out of budget.</w:t>
       </w:r>
     </w:p>
     <w:p>
@@ -18252,7 +18530,7 @@
           <w:b w:val="0"/>
           <w:i w:val="0"/>
         </w:rPr>
-        <w:t>12. From 09-29: re-evaluate cost per click on every campaign now receiving its top-of-search clicks — probe down 3–5% a step while click share holds — and grade every write in this list.</w:t>
+        <w:t>12. From 09-29: campaigns at their requirement — probe cost per click down 3–5% a step while click share holds; campaigns short of it — step down to break-even over two writes four days apart (or hold one week where the 7-day rank reached the target range). Grade every write in this list.</w:t>
       </w:r>
     </w:p>
     <w:sectPr>

</xml_diff>

<commit_message>
Loss stop: use a campaign's own TOS conversion from 15 clicks (was 30)
Co-Authored-By: Claude Opus 5.5 <noreply@anthropic.com>
Claude-Session: https://claude.ai/code/session_01FvXHKtbYmE3ru99HYV2muV
</commit_message>
<xml_diff>
--- a/docs/DBS4_Corrections_by_Situation_20260921-dbcd48b8.docx
+++ b/docs/DBS4_Corrections_by_Situation_20260921-dbcd48b8.docx
@@ -963,7 +963,7 @@
           <w:b w:val="0"/>
           <w:i w:val="0"/>
         </w:rPr>
-        <w:t>Four things, each written on the row. (1) The loss stop: the top-of-search price may not pass the point where a top-of-search order costs more than 3× contribution — 3 × contribution (the advertised child’s; $25.06 on average) × the campaign’s top-of-search conversion rate (its own, with 30+ top-of-search clicks in 90 days; otherwise the product’s planning rate). Every pushed row carries its cost and loss per order at the new price. Contribution is at list price; the deal price is lower, so the true loss per order in the deal is somewhat higher than written. (2) The share stop: impression share at 40% or more and not rising after the last step — the requirement is overstated, not the price; it is re-based from actual volume. (3) The reachability check: delivered clicks ÷ impression share is what winning the whole auction would buy; where the requirement is above that, the campaign is pushed toward share and graded on share, not on an unbuyable click count. (4) The envelope: the whole deal push runs inside 1.5× today’s daily spend on these campaigns for 09-24 → 09-28; when it is spent, every row holds.</w:t>
+        <w:t>Four things, each written on the row. (1) The loss stop: the top-of-search price may not pass the point where a top-of-search order costs more than 3× contribution — 3 × contribution (the advertised child’s; $25.06 on average) × the campaign’s top-of-search conversion rate (its own when it has 15 or more top-of-search clicks in 90 days; under 15, the product’s average across all exact ranking campaigns, 15.5%). Every pushed row carries its cost and loss per order at the new price. Contribution is at list price; the deal price is lower, so the true loss per order in the deal is somewhat higher than written. (2) The share stop: impression share at 40% or more and not rising after the last step — the requirement is overstated, not the price; it is re-based from actual volume. (3) The reachability check: delivered clicks ÷ impression share is what winning the whole auction would buy; where the requirement is above that, the campaign is pushed toward share and graded on share, not on an unbuyable click count. (4) The envelope: the whole deal push runs inside 1.5× today’s daily spend on these campaigns for 09-24 → 09-28; when it is spent, every row holds.</w:t>
       </w:r>
     </w:p>
     <w:p>
@@ -1301,7 +1301,7 @@
                 <w:i w:val="0"/>
                 <w:sz w:val="15"/>
               </w:rPr>
-              <w:t>1</w:t>
+              <w:t>0</w:t>
             </w:r>
           </w:p>
         </w:tc>
@@ -1436,7 +1436,7 @@
                 <w:i w:val="0"/>
                 <w:sz w:val="15"/>
               </w:rPr>
-              <w:t>0</w:t>
+              <w:t>1</w:t>
             </w:r>
           </w:p>
         </w:tc>
@@ -1601,7 +1601,7 @@
                 <w:i w:val="0"/>
                 <w:sz w:val="15"/>
               </w:rPr>
-              <w:t>$10</w:t>
+              <w:t>$13</w:t>
             </w:r>
           </w:p>
         </w:tc>
@@ -1926,7 +1926,7 @@
           <w:b w:val="0"/>
           <w:i w:val="0"/>
         </w:rPr>
-        <w:t xml:space="preserve"> in total ($891 a day). At the new prices with clicks unchanged they would spend about $774 a day; every click the push adds comes on top, so the envelope — not a price cap — is what ends an over-running push. The loss per order is computed on the full top-of-search price; what Amazon charges is at or below it, so it is an upper bound.</w:t>
+        <w:t xml:space="preserve"> in total ($891 a day). At the new prices with clicks unchanged they would spend about $772 a day; every click the push adds comes on top, so the envelope — not a price cap — is what ends an over-running push. The loss per order is computed on the full top-of-search price; what Amazon charges is at or below it, so it is an upper bound.</w:t>
       </w:r>
     </w:p>
     <w:p>

</xml_diff>